<commit_message>
Uskladi seminarski rad sa komentarom profesora
</commit_message>
<xml_diff>
--- a/Dokumentacija/Seminarski_rad_RVS_Sportski_klub_Lazar_Malesev_SI_44_22.docx
+++ b/Dokumentacija/Seminarski_rad_RVS_Sportski_klub_Lazar_Malesev_SI_44_22.docx
@@ -379,16 +379,17 @@
     </w:p>
     <w:p>
       <w:pPr>
+        <w:keepLines/>
         <w:tabs>
-          <w:tab w:pos="8986" w:val="right" w:leader="dot"/>
+          <w:tab w:pos="8731" w:val="right" w:leader="dot"/>
         </w:tabs>
         <w:spacing w:before="0" w:after="0" w:line="240" w:lineRule="auto"/>
         <w:ind w:left="0" w:firstLine="0"/>
       </w:pPr>
       <w:r>
         <w:rPr>
-          <w:rFonts w:ascii="Times New Roman" w:hAnsi="Times New Roman" w:eastAsia="Times New Roman"/>
-          <w:b w:val="0"/>
+          <w:rFonts w:ascii="Times New Roman" w:hAnsi="Times New Roman"/>
+          <w:sz w:val="18"/>
         </w:rPr>
         <w:t>1. Opis namene aplikacije u kontekstu poslovnog procesa i poslovnog pravila</w:t>
         <w:tab/>
@@ -396,29 +397,24 @@
       </w:r>
       <w:r>
         <w:rPr>
-          <w:rFonts w:ascii="Times New Roman" w:hAnsi="Times New Roman" w:eastAsia="Times New Roman"/>
-          <w:b w:val="0"/>
-        </w:rPr>
-      </w:r>
-      <w:r>
-        <w:rPr>
-          <w:rFonts w:ascii="Times New Roman" w:hAnsi="Times New Roman" w:eastAsia="Times New Roman"/>
-          <w:b w:val="0"/>
+          <w:rFonts w:ascii="Times New Roman" w:hAnsi="Times New Roman"/>
+          <w:sz w:val="18"/>
         </w:rPr>
       </w:r>
     </w:p>
     <w:p>
       <w:pPr>
+        <w:keepLines/>
         <w:tabs>
-          <w:tab w:pos="8986" w:val="right" w:leader="dot"/>
+          <w:tab w:pos="8731" w:val="right" w:leader="dot"/>
         </w:tabs>
         <w:spacing w:before="0" w:after="0" w:line="240" w:lineRule="auto"/>
         <w:ind w:left="0" w:firstLine="0"/>
       </w:pPr>
       <w:r>
         <w:rPr>
-          <w:rFonts w:ascii="Times New Roman" w:hAnsi="Times New Roman" w:eastAsia="Times New Roman"/>
-          <w:b w:val="0"/>
+          <w:rFonts w:ascii="Times New Roman" w:hAnsi="Times New Roman"/>
+          <w:sz w:val="18"/>
         </w:rPr>
         <w:t>2. Dokument i analiza dokumenta</w:t>
         <w:tab/>
@@ -426,29 +422,24 @@
       </w:r>
       <w:r>
         <w:rPr>
-          <w:rFonts w:ascii="Times New Roman" w:hAnsi="Times New Roman" w:eastAsia="Times New Roman"/>
-          <w:b w:val="0"/>
-        </w:rPr>
-      </w:r>
-      <w:r>
-        <w:rPr>
-          <w:rFonts w:ascii="Times New Roman" w:hAnsi="Times New Roman" w:eastAsia="Times New Roman"/>
-          <w:b w:val="0"/>
+          <w:rFonts w:ascii="Times New Roman" w:hAnsi="Times New Roman"/>
+          <w:sz w:val="18"/>
         </w:rPr>
       </w:r>
     </w:p>
     <w:p>
       <w:pPr>
+        <w:keepLines/>
         <w:tabs>
-          <w:tab w:pos="8986" w:val="right" w:leader="dot"/>
+          <w:tab w:pos="8731" w:val="right" w:leader="dot"/>
         </w:tabs>
         <w:spacing w:before="0" w:after="0" w:line="240" w:lineRule="auto"/>
-        <w:ind w:left="255" w:firstLine="0"/>
+        <w:ind w:left="312" w:firstLine="0"/>
       </w:pPr>
       <w:r>
         <w:rPr>
-          <w:rFonts w:ascii="Times New Roman" w:hAnsi="Times New Roman" w:eastAsia="Times New Roman"/>
-          <w:b w:val="0"/>
+          <w:rFonts w:ascii="Times New Roman" w:hAnsi="Times New Roman"/>
+          <w:sz w:val="18"/>
         </w:rPr>
         <w:t>2.1. Prikaz izgleda dokumenta</w:t>
         <w:tab/>
@@ -456,29 +447,24 @@
       </w:r>
       <w:r>
         <w:rPr>
-          <w:rFonts w:ascii="Times New Roman" w:hAnsi="Times New Roman" w:eastAsia="Times New Roman"/>
-          <w:b w:val="0"/>
-        </w:rPr>
-      </w:r>
-      <w:r>
-        <w:rPr>
-          <w:rFonts w:ascii="Times New Roman" w:hAnsi="Times New Roman" w:eastAsia="Times New Roman"/>
-          <w:b w:val="0"/>
+          <w:rFonts w:ascii="Times New Roman" w:hAnsi="Times New Roman"/>
+          <w:sz w:val="18"/>
         </w:rPr>
       </w:r>
     </w:p>
     <w:p>
       <w:pPr>
+        <w:keepLines/>
         <w:tabs>
-          <w:tab w:pos="8986" w:val="right" w:leader="dot"/>
+          <w:tab w:pos="8731" w:val="right" w:leader="dot"/>
         </w:tabs>
         <w:spacing w:before="0" w:after="0" w:line="240" w:lineRule="auto"/>
-        <w:ind w:left="255" w:firstLine="0"/>
+        <w:ind w:left="312" w:firstLine="0"/>
       </w:pPr>
       <w:r>
         <w:rPr>
-          <w:rFonts w:ascii="Times New Roman" w:hAnsi="Times New Roman" w:eastAsia="Times New Roman"/>
-          <w:b w:val="0"/>
+          <w:rFonts w:ascii="Times New Roman" w:hAnsi="Times New Roman"/>
+          <w:sz w:val="18"/>
         </w:rPr>
         <w:t>2.2. Analiza dokumenta</w:t>
         <w:tab/>
@@ -486,836 +472,916 @@
       </w:r>
       <w:r>
         <w:rPr>
-          <w:rFonts w:ascii="Times New Roman" w:hAnsi="Times New Roman" w:eastAsia="Times New Roman"/>
-          <w:b w:val="0"/>
-        </w:rPr>
-      </w:r>
-      <w:r>
-        <w:rPr>
-          <w:rFonts w:ascii="Times New Roman" w:hAnsi="Times New Roman" w:eastAsia="Times New Roman"/>
-          <w:b w:val="0"/>
+          <w:rFonts w:ascii="Times New Roman" w:hAnsi="Times New Roman"/>
+          <w:sz w:val="18"/>
         </w:rPr>
       </w:r>
     </w:p>
     <w:p>
       <w:pPr>
+        <w:keepLines/>
         <w:tabs>
-          <w:tab w:pos="8986" w:val="right" w:leader="dot"/>
+          <w:tab w:pos="8731" w:val="right" w:leader="dot"/>
         </w:tabs>
         <w:spacing w:before="0" w:after="0" w:line="240" w:lineRule="auto"/>
         <w:ind w:left="0" w:firstLine="0"/>
       </w:pPr>
       <w:r>
         <w:rPr>
-          <w:rFonts w:ascii="Times New Roman" w:hAnsi="Times New Roman" w:eastAsia="Times New Roman"/>
-          <w:b w:val="0"/>
+          <w:rFonts w:ascii="Times New Roman" w:hAnsi="Times New Roman"/>
+          <w:sz w:val="18"/>
         </w:rPr>
-        <w:t>3. Kratak opis primenjenih alata</w:t>
-        <w:tab/>
-        <w:t>6</w:t>
-      </w:r>
-      <w:r>
-        <w:rPr>
-          <w:rFonts w:ascii="Times New Roman" w:hAnsi="Times New Roman" w:eastAsia="Times New Roman"/>
-          <w:b w:val="0"/>
-        </w:rPr>
-      </w:r>
-      <w:r>
-        <w:rPr>
-          <w:rFonts w:ascii="Times New Roman" w:hAnsi="Times New Roman" w:eastAsia="Times New Roman"/>
-          <w:b w:val="0"/>
-        </w:rPr>
-      </w:r>
-    </w:p>
-    <w:p>
-      <w:pPr>
-        <w:tabs>
-          <w:tab w:pos="8986" w:val="right" w:leader="dot"/>
-        </w:tabs>
-        <w:spacing w:before="0" w:after="0" w:line="240" w:lineRule="auto"/>
-        <w:ind w:left="0" w:firstLine="0"/>
-      </w:pPr>
-      <w:r>
-        <w:rPr>
-          <w:rFonts w:ascii="Times New Roman" w:hAnsi="Times New Roman" w:eastAsia="Times New Roman"/>
-          <w:b w:val="0"/>
-        </w:rPr>
-        <w:t>4. Modeli dokumentovanja realizovanog rešenja</w:t>
+        <w:t>3. Korisničko uputstvo</w:t>
         <w:tab/>
         <w:t>7</w:t>
       </w:r>
       <w:r>
         <w:rPr>
-          <w:rFonts w:ascii="Times New Roman" w:hAnsi="Times New Roman" w:eastAsia="Times New Roman"/>
-          <w:b w:val="0"/>
-        </w:rPr>
-      </w:r>
-      <w:r>
-        <w:rPr>
-          <w:rFonts w:ascii="Times New Roman" w:hAnsi="Times New Roman" w:eastAsia="Times New Roman"/>
-          <w:b w:val="0"/>
+          <w:rFonts w:ascii="Times New Roman" w:hAnsi="Times New Roman"/>
+          <w:sz w:val="18"/>
         </w:rPr>
       </w:r>
     </w:p>
     <w:p>
       <w:pPr>
+        <w:keepLines/>
         <w:tabs>
-          <w:tab w:pos="8986" w:val="right" w:leader="dot"/>
+          <w:tab w:pos="8731" w:val="right" w:leader="dot"/>
         </w:tabs>
         <w:spacing w:before="0" w:after="0" w:line="240" w:lineRule="auto"/>
-        <w:ind w:left="255" w:firstLine="0"/>
+        <w:ind w:left="312" w:firstLine="0"/>
       </w:pPr>
       <w:r>
         <w:rPr>
-          <w:rFonts w:ascii="Times New Roman" w:hAnsi="Times New Roman" w:eastAsia="Times New Roman"/>
-          <w:b w:val="0"/>
+          <w:rFonts w:ascii="Times New Roman" w:hAnsi="Times New Roman"/>
+          <w:sz w:val="18"/>
         </w:rPr>
-        <w:t>4.1. Dijagram slučajeva korišćenja</w:t>
+        <w:t>3.1. Preduslovi i pokretanje aplikacije</w:t>
         <w:tab/>
         <w:t>7</w:t>
       </w:r>
       <w:r>
         <w:rPr>
-          <w:rFonts w:ascii="Times New Roman" w:hAnsi="Times New Roman" w:eastAsia="Times New Roman"/>
-          <w:b w:val="0"/>
-        </w:rPr>
-      </w:r>
-      <w:r>
-        <w:rPr>
-          <w:rFonts w:ascii="Times New Roman" w:hAnsi="Times New Roman" w:eastAsia="Times New Roman"/>
-          <w:b w:val="0"/>
+          <w:rFonts w:ascii="Times New Roman" w:hAnsi="Times New Roman"/>
+          <w:sz w:val="18"/>
         </w:rPr>
       </w:r>
     </w:p>
     <w:p>
       <w:pPr>
+        <w:keepLines/>
         <w:tabs>
-          <w:tab w:pos="8986" w:val="right" w:leader="dot"/>
+          <w:tab w:pos="8731" w:val="right" w:leader="dot"/>
         </w:tabs>
         <w:spacing w:before="0" w:after="0" w:line="240" w:lineRule="auto"/>
-        <w:ind w:left="255" w:firstLine="0"/>
+        <w:ind w:left="312" w:firstLine="0"/>
       </w:pPr>
       <w:r>
         <w:rPr>
-          <w:rFonts w:ascii="Times New Roman" w:hAnsi="Times New Roman" w:eastAsia="Times New Roman"/>
-          <w:b w:val="0"/>
+          <w:rFonts w:ascii="Times New Roman" w:hAnsi="Times New Roman"/>
+          <w:sz w:val="18"/>
         </w:rPr>
-        <w:t>4.2. Relacioni model podataka</w:t>
+        <w:t>3.2. Prijava, uloge i odjava</w:t>
         <w:tab/>
         <w:t>8</w:t>
       </w:r>
       <w:r>
         <w:rPr>
-          <w:rFonts w:ascii="Times New Roman" w:hAnsi="Times New Roman" w:eastAsia="Times New Roman"/>
-          <w:b w:val="0"/>
-        </w:rPr>
-      </w:r>
-      <w:r>
-        <w:rPr>
-          <w:rFonts w:ascii="Times New Roman" w:hAnsi="Times New Roman" w:eastAsia="Times New Roman"/>
-          <w:b w:val="0"/>
+          <w:rFonts w:ascii="Times New Roman" w:hAnsi="Times New Roman"/>
+          <w:sz w:val="18"/>
         </w:rPr>
       </w:r>
     </w:p>
     <w:p>
       <w:pPr>
+        <w:keepLines/>
         <w:tabs>
-          <w:tab w:pos="8986" w:val="right" w:leader="dot"/>
+          <w:tab w:pos="8731" w:val="right" w:leader="dot"/>
         </w:tabs>
         <w:spacing w:before="0" w:after="0" w:line="240" w:lineRule="auto"/>
-        <w:ind w:left="255" w:firstLine="0"/>
+        <w:ind w:left="312" w:firstLine="0"/>
       </w:pPr>
       <w:r>
         <w:rPr>
-          <w:rFonts w:ascii="Times New Roman" w:hAnsi="Times New Roman" w:eastAsia="Times New Roman"/>
-          <w:b w:val="0"/>
+          <w:rFonts w:ascii="Times New Roman" w:hAnsi="Times New Roman"/>
+          <w:sz w:val="18"/>
         </w:rPr>
-        <w:t>4.3. Dijagram komponenti</w:t>
-        <w:tab/>
-        <w:t>9</w:t>
-      </w:r>
-      <w:r>
-        <w:rPr>
-          <w:rFonts w:ascii="Times New Roman" w:hAnsi="Times New Roman" w:eastAsia="Times New Roman"/>
-          <w:b w:val="0"/>
-        </w:rPr>
-      </w:r>
-      <w:r>
-        <w:rPr>
-          <w:rFonts w:ascii="Times New Roman" w:hAnsi="Times New Roman" w:eastAsia="Times New Roman"/>
-          <w:b w:val="0"/>
-        </w:rPr>
-      </w:r>
-    </w:p>
-    <w:p>
-      <w:pPr>
-        <w:tabs>
-          <w:tab w:pos="8986" w:val="right" w:leader="dot"/>
-        </w:tabs>
-        <w:spacing w:before="0" w:after="0" w:line="240" w:lineRule="auto"/>
-        <w:ind w:left="255" w:firstLine="0"/>
-      </w:pPr>
-      <w:r>
-        <w:rPr>
-          <w:rFonts w:ascii="Times New Roman" w:hAnsi="Times New Roman" w:eastAsia="Times New Roman"/>
-          <w:b w:val="0"/>
-        </w:rPr>
-        <w:t>4.4. Dijagram klasa</w:t>
+        <w:t>3.3. Pregled i filtriranje zahteva</w:t>
         <w:tab/>
         <w:t>10</w:t>
       </w:r>
       <w:r>
         <w:rPr>
-          <w:rFonts w:ascii="Times New Roman" w:hAnsi="Times New Roman" w:eastAsia="Times New Roman"/>
-          <w:b w:val="0"/>
-        </w:rPr>
-      </w:r>
-      <w:r>
-        <w:rPr>
-          <w:rFonts w:ascii="Times New Roman" w:hAnsi="Times New Roman" w:eastAsia="Times New Roman"/>
-          <w:b w:val="0"/>
+          <w:rFonts w:ascii="Times New Roman" w:hAnsi="Times New Roman"/>
+          <w:sz w:val="18"/>
         </w:rPr>
       </w:r>
     </w:p>
     <w:p>
       <w:pPr>
+        <w:keepLines/>
         <w:tabs>
-          <w:tab w:pos="8986" w:val="right" w:leader="dot"/>
+          <w:tab w:pos="8731" w:val="right" w:leader="dot"/>
         </w:tabs>
         <w:spacing w:before="0" w:after="0" w:line="240" w:lineRule="auto"/>
-        <w:ind w:left="255" w:firstLine="0"/>
+        <w:ind w:left="312" w:firstLine="0"/>
       </w:pPr>
       <w:r>
         <w:rPr>
-          <w:rFonts w:ascii="Times New Roman" w:hAnsi="Times New Roman" w:eastAsia="Times New Roman"/>
-          <w:b w:val="0"/>
+          <w:rFonts w:ascii="Times New Roman" w:hAnsi="Times New Roman"/>
+          <w:sz w:val="18"/>
         </w:rPr>
-        <w:t>4.5. Dijagrami sekvenci</w:t>
+        <w:t>3.4. Unos, validacija i izmena zahteva</w:t>
         <w:tab/>
         <w:t>11</w:t>
       </w:r>
       <w:r>
         <w:rPr>
-          <w:rFonts w:ascii="Times New Roman" w:hAnsi="Times New Roman" w:eastAsia="Times New Roman"/>
-          <w:b w:val="0"/>
-        </w:rPr>
-      </w:r>
-      <w:r>
-        <w:rPr>
-          <w:rFonts w:ascii="Times New Roman" w:hAnsi="Times New Roman" w:eastAsia="Times New Roman"/>
-          <w:b w:val="0"/>
+          <w:rFonts w:ascii="Times New Roman" w:hAnsi="Times New Roman"/>
+          <w:sz w:val="18"/>
         </w:rPr>
       </w:r>
     </w:p>
     <w:p>
       <w:pPr>
+        <w:keepLines/>
         <w:tabs>
-          <w:tab w:pos="8986" w:val="right" w:leader="dot"/>
+          <w:tab w:pos="8731" w:val="right" w:leader="dot"/>
         </w:tabs>
         <w:spacing w:before="0" w:after="0" w:line="240" w:lineRule="auto"/>
-        <w:ind w:left="510" w:firstLine="0"/>
+        <w:ind w:left="312" w:firstLine="0"/>
       </w:pPr>
       <w:r>
         <w:rPr>
-          <w:rFonts w:ascii="Times New Roman" w:hAnsi="Times New Roman" w:eastAsia="Times New Roman"/>
-          <w:b w:val="0"/>
+          <w:rFonts w:ascii="Times New Roman" w:hAnsi="Times New Roman"/>
+          <w:sz w:val="18"/>
         </w:rPr>
-        <w:t>4.5.1. Dijagram sekvenci za unos zahteva</w:t>
+        <w:t>3.5. Detalji i provera poslovnog pravila</w:t>
         <w:tab/>
-        <w:t>11</w:t>
+        <w:t>14</w:t>
       </w:r>
       <w:r>
         <w:rPr>
-          <w:rFonts w:ascii="Times New Roman" w:hAnsi="Times New Roman" w:eastAsia="Times New Roman"/>
-          <w:b w:val="0"/>
-        </w:rPr>
-      </w:r>
-      <w:r>
-        <w:rPr>
-          <w:rFonts w:ascii="Times New Roman" w:hAnsi="Times New Roman" w:eastAsia="Times New Roman"/>
-          <w:b w:val="0"/>
+          <w:rFonts w:ascii="Times New Roman" w:hAnsi="Times New Roman"/>
+          <w:sz w:val="18"/>
         </w:rPr>
       </w:r>
     </w:p>
     <w:p>
       <w:pPr>
+        <w:keepLines/>
         <w:tabs>
-          <w:tab w:pos="8986" w:val="right" w:leader="dot"/>
+          <w:tab w:pos="8731" w:val="right" w:leader="dot"/>
         </w:tabs>
         <w:spacing w:before="0" w:after="0" w:line="240" w:lineRule="auto"/>
-        <w:ind w:left="510" w:firstLine="0"/>
+        <w:ind w:left="312" w:firstLine="0"/>
       </w:pPr>
       <w:r>
         <w:rPr>
-          <w:rFonts w:ascii="Times New Roman" w:hAnsi="Times New Roman" w:eastAsia="Times New Roman"/>
-          <w:b w:val="0"/>
+          <w:rFonts w:ascii="Times New Roman" w:hAnsi="Times New Roman"/>
+          <w:sz w:val="18"/>
         </w:rPr>
-        <w:t>4.5.2. Dijagram sekvenci za tabelarni prikaz i filtriranje zahteva</w:t>
+        <w:t>3.6. Brisanje zahteva</w:t>
         <w:tab/>
-        <w:t>12</w:t>
+        <w:t>17</w:t>
       </w:r>
       <w:r>
         <w:rPr>
-          <w:rFonts w:ascii="Times New Roman" w:hAnsi="Times New Roman" w:eastAsia="Times New Roman"/>
-          <w:b w:val="0"/>
-        </w:rPr>
-      </w:r>
-      <w:r>
-        <w:rPr>
-          <w:rFonts w:ascii="Times New Roman" w:hAnsi="Times New Roman" w:eastAsia="Times New Roman"/>
-          <w:b w:val="0"/>
+          <w:rFonts w:ascii="Times New Roman" w:hAnsi="Times New Roman"/>
+          <w:sz w:val="18"/>
         </w:rPr>
       </w:r>
     </w:p>
     <w:p>
       <w:pPr>
+        <w:keepLines/>
         <w:tabs>
-          <w:tab w:pos="8986" w:val="right" w:leader="dot"/>
+          <w:tab w:pos="8731" w:val="right" w:leader="dot"/>
         </w:tabs>
         <w:spacing w:before="0" w:after="0" w:line="240" w:lineRule="auto"/>
-        <w:ind w:left="0" w:firstLine="0"/>
+        <w:ind w:left="312" w:firstLine="0"/>
       </w:pPr>
       <w:r>
         <w:rPr>
-          <w:rFonts w:ascii="Times New Roman" w:hAnsi="Times New Roman" w:eastAsia="Times New Roman"/>
-          <w:b w:val="0"/>
+          <w:rFonts w:ascii="Times New Roman" w:hAnsi="Times New Roman"/>
+          <w:sz w:val="18"/>
         </w:rPr>
-        <w:t>5. Ključni delovi koda sa objašnjenjem</w:t>
+        <w:t>3.7. Štampa zahteva</w:t>
         <w:tab/>
-        <w:t>13</w:t>
+        <w:t>18</w:t>
       </w:r>
       <w:r>
         <w:rPr>
-          <w:rFonts w:ascii="Times New Roman" w:hAnsi="Times New Roman" w:eastAsia="Times New Roman"/>
-          <w:b w:val="0"/>
-        </w:rPr>
-      </w:r>
-      <w:r>
-        <w:rPr>
-          <w:rFonts w:ascii="Times New Roman" w:hAnsi="Times New Roman" w:eastAsia="Times New Roman"/>
-          <w:b w:val="0"/>
+          <w:rFonts w:ascii="Times New Roman" w:hAnsi="Times New Roman"/>
+          <w:sz w:val="18"/>
         </w:rPr>
       </w:r>
     </w:p>
     <w:p>
       <w:pPr>
+        <w:keepLines/>
         <w:tabs>
-          <w:tab w:pos="8986" w:val="right" w:leader="dot"/>
+          <w:tab w:pos="8731" w:val="right" w:leader="dot"/>
         </w:tabs>
         <w:spacing w:before="0" w:after="0" w:line="240" w:lineRule="auto"/>
-        <w:ind w:left="255" w:firstLine="0"/>
+        <w:ind w:left="312" w:firstLine="0"/>
       </w:pPr>
       <w:r>
         <w:rPr>
-          <w:rFonts w:ascii="Times New Roman" w:hAnsi="Times New Roman" w:eastAsia="Times New Roman"/>
-          <w:b w:val="0"/>
+          <w:rFonts w:ascii="Times New Roman" w:hAnsi="Times New Roman"/>
+          <w:sz w:val="18"/>
         </w:rPr>
-        <w:t>5.1. Realizacija korisničkih softverskih funkcija</w:t>
+        <w:t>3.8. Pregled REST servisa</w:t>
         <w:tab/>
-        <w:t>13</w:t>
+        <w:t>19</w:t>
       </w:r>
       <w:r>
         <w:rPr>
-          <w:rFonts w:ascii="Times New Roman" w:hAnsi="Times New Roman" w:eastAsia="Times New Roman"/>
-          <w:b w:val="0"/>
-        </w:rPr>
-      </w:r>
-      <w:r>
-        <w:rPr>
-          <w:rFonts w:ascii="Times New Roman" w:hAnsi="Times New Roman" w:eastAsia="Times New Roman"/>
-          <w:b w:val="0"/>
+          <w:rFonts w:ascii="Times New Roman" w:hAnsi="Times New Roman"/>
+          <w:sz w:val="18"/>
         </w:rPr>
       </w:r>
     </w:p>
     <w:p>
       <w:pPr>
+        <w:keepLines/>
         <w:tabs>
-          <w:tab w:pos="8986" w:val="right" w:leader="dot"/>
+          <w:tab w:pos="8731" w:val="right" w:leader="dot"/>
         </w:tabs>
         <w:spacing w:before="0" w:after="0" w:line="240" w:lineRule="auto"/>
-        <w:ind w:left="510" w:firstLine="0"/>
+        <w:ind w:left="0" w:firstLine="0"/>
       </w:pPr>
       <w:r>
         <w:rPr>
-          <w:rFonts w:ascii="Times New Roman" w:hAnsi="Times New Roman" w:eastAsia="Times New Roman"/>
-          <w:b w:val="0"/>
+          <w:rFonts w:ascii="Times New Roman" w:hAnsi="Times New Roman"/>
+          <w:sz w:val="18"/>
         </w:rPr>
-        <w:t>5.1.1. Prijava korisnika</w:t>
+        <w:t>4. Kratak opis primenjenih alata</w:t>
         <w:tab/>
-        <w:t>13</w:t>
+        <w:t>20</w:t>
       </w:r>
       <w:r>
         <w:rPr>
-          <w:rFonts w:ascii="Times New Roman" w:hAnsi="Times New Roman" w:eastAsia="Times New Roman"/>
-          <w:b w:val="0"/>
-        </w:rPr>
-      </w:r>
-      <w:r>
-        <w:rPr>
-          <w:rFonts w:ascii="Times New Roman" w:hAnsi="Times New Roman" w:eastAsia="Times New Roman"/>
-          <w:b w:val="0"/>
+          <w:rFonts w:ascii="Times New Roman" w:hAnsi="Times New Roman"/>
+          <w:sz w:val="18"/>
         </w:rPr>
       </w:r>
     </w:p>
     <w:p>
       <w:pPr>
+        <w:keepLines/>
         <w:tabs>
-          <w:tab w:pos="8986" w:val="right" w:leader="dot"/>
+          <w:tab w:pos="8731" w:val="right" w:leader="dot"/>
         </w:tabs>
         <w:spacing w:before="0" w:after="0" w:line="240" w:lineRule="auto"/>
-        <w:ind w:left="510" w:firstLine="0"/>
+        <w:ind w:left="0" w:firstLine="0"/>
       </w:pPr>
       <w:r>
         <w:rPr>
-          <w:rFonts w:ascii="Times New Roman" w:hAnsi="Times New Roman" w:eastAsia="Times New Roman"/>
-          <w:b w:val="0"/>
+          <w:rFonts w:ascii="Times New Roman" w:hAnsi="Times New Roman"/>
+          <w:sz w:val="18"/>
         </w:rPr>
-        <w:t>5.1.2. CRUD operacije nad glavnom tabelom</w:t>
+        <w:t>5. Modeli dokumentovanja realizovanog rešenja</w:t>
         <w:tab/>
-        <w:t>15</w:t>
+        <w:t>21</w:t>
       </w:r>
       <w:r>
         <w:rPr>
-          <w:rFonts w:ascii="Times New Roman" w:hAnsi="Times New Roman" w:eastAsia="Times New Roman"/>
-          <w:b w:val="0"/>
-        </w:rPr>
-      </w:r>
-      <w:r>
-        <w:rPr>
-          <w:rFonts w:ascii="Times New Roman" w:hAnsi="Times New Roman" w:eastAsia="Times New Roman"/>
-          <w:b w:val="0"/>
+          <w:rFonts w:ascii="Times New Roman" w:hAnsi="Times New Roman"/>
+          <w:sz w:val="18"/>
         </w:rPr>
       </w:r>
     </w:p>
     <w:p>
       <w:pPr>
+        <w:keepLines/>
         <w:tabs>
-          <w:tab w:pos="8986" w:val="right" w:leader="dot"/>
+          <w:tab w:pos="8731" w:val="right" w:leader="dot"/>
         </w:tabs>
         <w:spacing w:before="0" w:after="0" w:line="240" w:lineRule="auto"/>
-        <w:ind w:left="510" w:firstLine="0"/>
+        <w:ind w:left="312" w:firstLine="0"/>
       </w:pPr>
       <w:r>
         <w:rPr>
-          <w:rFonts w:ascii="Times New Roman" w:hAnsi="Times New Roman" w:eastAsia="Times New Roman"/>
-          <w:b w:val="0"/>
+          <w:rFonts w:ascii="Times New Roman" w:hAnsi="Times New Roman"/>
+          <w:sz w:val="18"/>
         </w:rPr>
-        <w:t>5.1.3. Štampa, filtrirana štampa i pojedinačna parametarska štampa</w:t>
+        <w:t>5.1. Dijagram slučajeva korišćenja</w:t>
+        <w:tab/>
+        <w:t>21</w:t>
+      </w:r>
+      <w:r>
+        <w:rPr>
+          <w:rFonts w:ascii="Times New Roman" w:hAnsi="Times New Roman"/>
+          <w:sz w:val="18"/>
+        </w:rPr>
+      </w:r>
+    </w:p>
+    <w:p>
+      <w:pPr>
+        <w:keepLines/>
+        <w:tabs>
+          <w:tab w:pos="8731" w:val="right" w:leader="dot"/>
+        </w:tabs>
+        <w:spacing w:before="0" w:after="0" w:line="240" w:lineRule="auto"/>
+        <w:ind w:left="312" w:firstLine="0"/>
+      </w:pPr>
+      <w:r>
+        <w:rPr>
+          <w:rFonts w:ascii="Times New Roman" w:hAnsi="Times New Roman"/>
+          <w:sz w:val="18"/>
+        </w:rPr>
+        <w:t>5.2. Relacioni model podataka</w:t>
+        <w:tab/>
+        <w:t>22</w:t>
+      </w:r>
+      <w:r>
+        <w:rPr>
+          <w:rFonts w:ascii="Times New Roman" w:hAnsi="Times New Roman"/>
+          <w:sz w:val="18"/>
+        </w:rPr>
+      </w:r>
+    </w:p>
+    <w:p>
+      <w:pPr>
+        <w:keepLines/>
+        <w:tabs>
+          <w:tab w:pos="8731" w:val="right" w:leader="dot"/>
+        </w:tabs>
+        <w:spacing w:before="0" w:after="0" w:line="240" w:lineRule="auto"/>
+        <w:ind w:left="312" w:firstLine="0"/>
+      </w:pPr>
+      <w:r>
+        <w:rPr>
+          <w:rFonts w:ascii="Times New Roman" w:hAnsi="Times New Roman"/>
+          <w:sz w:val="18"/>
+        </w:rPr>
+        <w:t>5.3. Dijagram komponenti</w:t>
         <w:tab/>
         <w:t>23</w:t>
       </w:r>
       <w:r>
         <w:rPr>
-          <w:rFonts w:ascii="Times New Roman" w:hAnsi="Times New Roman" w:eastAsia="Times New Roman"/>
-          <w:b w:val="0"/>
-        </w:rPr>
-      </w:r>
-      <w:r>
-        <w:rPr>
-          <w:rFonts w:ascii="Times New Roman" w:hAnsi="Times New Roman" w:eastAsia="Times New Roman"/>
-          <w:b w:val="0"/>
+          <w:rFonts w:ascii="Times New Roman" w:hAnsi="Times New Roman"/>
+          <w:sz w:val="18"/>
         </w:rPr>
       </w:r>
     </w:p>
     <w:p>
       <w:pPr>
+        <w:keepLines/>
         <w:tabs>
-          <w:tab w:pos="8986" w:val="right" w:leader="dot"/>
+          <w:tab w:pos="8731" w:val="right" w:leader="dot"/>
         </w:tabs>
         <w:spacing w:before="0" w:after="0" w:line="240" w:lineRule="auto"/>
-        <w:ind w:left="255" w:firstLine="0"/>
+        <w:ind w:left="312" w:firstLine="0"/>
       </w:pPr>
       <w:r>
         <w:rPr>
-          <w:rFonts w:ascii="Times New Roman" w:hAnsi="Times New Roman" w:eastAsia="Times New Roman"/>
-          <w:b w:val="0"/>
+          <w:rFonts w:ascii="Times New Roman" w:hAnsi="Times New Roman"/>
+          <w:sz w:val="18"/>
         </w:rPr>
-        <w:t>5.2. Realizacija osnovnih validacija</w:t>
+        <w:t>5.4. Dijagram klasa</w:t>
         <w:tab/>
         <w:t>24</w:t>
       </w:r>
       <w:r>
         <w:rPr>
-          <w:rFonts w:ascii="Times New Roman" w:hAnsi="Times New Roman" w:eastAsia="Times New Roman"/>
-          <w:b w:val="0"/>
-        </w:rPr>
-      </w:r>
-      <w:r>
-        <w:rPr>
-          <w:rFonts w:ascii="Times New Roman" w:hAnsi="Times New Roman" w:eastAsia="Times New Roman"/>
-          <w:b w:val="0"/>
+          <w:rFonts w:ascii="Times New Roman" w:hAnsi="Times New Roman"/>
+          <w:sz w:val="18"/>
         </w:rPr>
       </w:r>
     </w:p>
     <w:p>
       <w:pPr>
+        <w:keepLines/>
         <w:tabs>
-          <w:tab w:pos="8986" w:val="right" w:leader="dot"/>
+          <w:tab w:pos="8731" w:val="right" w:leader="dot"/>
         </w:tabs>
         <w:spacing w:before="0" w:after="0" w:line="240" w:lineRule="auto"/>
-        <w:ind w:left="255" w:firstLine="0"/>
+        <w:ind w:left="312" w:firstLine="0"/>
       </w:pPr>
       <w:r>
         <w:rPr>
-          <w:rFonts w:ascii="Times New Roman" w:hAnsi="Times New Roman" w:eastAsia="Times New Roman"/>
-          <w:b w:val="0"/>
+          <w:rFonts w:ascii="Times New Roman" w:hAnsi="Times New Roman"/>
+          <w:sz w:val="18"/>
         </w:rPr>
-        <w:t>5.3. Prezentacioni sloj - realizacija MVC i ViewModel-a</w:t>
+        <w:t>5.5. Dijagrami sekvenci</w:t>
+        <w:tab/>
+        <w:t>25</w:t>
+      </w:r>
+      <w:r>
+        <w:rPr>
+          <w:rFonts w:ascii="Times New Roman" w:hAnsi="Times New Roman"/>
+          <w:sz w:val="18"/>
+        </w:rPr>
+      </w:r>
+    </w:p>
+    <w:p>
+      <w:pPr>
+        <w:keepLines/>
+        <w:tabs>
+          <w:tab w:pos="8731" w:val="right" w:leader="dot"/>
+        </w:tabs>
+        <w:spacing w:before="0" w:after="0" w:line="240" w:lineRule="auto"/>
+        <w:ind w:left="624" w:firstLine="0"/>
+      </w:pPr>
+      <w:r>
+        <w:rPr>
+          <w:rFonts w:ascii="Times New Roman" w:hAnsi="Times New Roman"/>
+          <w:sz w:val="18"/>
+        </w:rPr>
+        <w:t>5.5.1. Dijagram sekvenci za unos zahteva</w:t>
+        <w:tab/>
+        <w:t>25</w:t>
+      </w:r>
+      <w:r>
+        <w:rPr>
+          <w:rFonts w:ascii="Times New Roman" w:hAnsi="Times New Roman"/>
+          <w:sz w:val="18"/>
+        </w:rPr>
+      </w:r>
+    </w:p>
+    <w:p>
+      <w:pPr>
+        <w:keepLines/>
+        <w:tabs>
+          <w:tab w:pos="8731" w:val="right" w:leader="dot"/>
+        </w:tabs>
+        <w:spacing w:before="0" w:after="0" w:line="240" w:lineRule="auto"/>
+        <w:ind w:left="624" w:firstLine="0"/>
+      </w:pPr>
+      <w:r>
+        <w:rPr>
+          <w:rFonts w:ascii="Times New Roman" w:hAnsi="Times New Roman"/>
+          <w:sz w:val="18"/>
+        </w:rPr>
+        <w:t>5.5.2. Dijagram sekvenci za tabelarni prikaz i filtriranje zahteva</w:t>
+        <w:tab/>
+        <w:t>26</w:t>
+      </w:r>
+      <w:r>
+        <w:rPr>
+          <w:rFonts w:ascii="Times New Roman" w:hAnsi="Times New Roman"/>
+          <w:sz w:val="18"/>
+        </w:rPr>
+      </w:r>
+    </w:p>
+    <w:p>
+      <w:pPr>
+        <w:keepLines/>
+        <w:tabs>
+          <w:tab w:pos="8731" w:val="right" w:leader="dot"/>
+        </w:tabs>
+        <w:spacing w:before="0" w:after="0" w:line="240" w:lineRule="auto"/>
+        <w:ind w:left="0" w:firstLine="0"/>
+      </w:pPr>
+      <w:r>
+        <w:rPr>
+          <w:rFonts w:ascii="Times New Roman" w:hAnsi="Times New Roman"/>
+          <w:sz w:val="18"/>
+        </w:rPr>
+        <w:t>6. Ključni delovi koda sa objašnjenjem</w:t>
         <w:tab/>
         <w:t>27</w:t>
       </w:r>
       <w:r>
         <w:rPr>
-          <w:rFonts w:ascii="Times New Roman" w:hAnsi="Times New Roman" w:eastAsia="Times New Roman"/>
-          <w:b w:val="0"/>
-        </w:rPr>
-      </w:r>
-      <w:r>
-        <w:rPr>
-          <w:rFonts w:ascii="Times New Roman" w:hAnsi="Times New Roman" w:eastAsia="Times New Roman"/>
-          <w:b w:val="0"/>
+          <w:rFonts w:ascii="Times New Roman" w:hAnsi="Times New Roman"/>
+          <w:sz w:val="18"/>
         </w:rPr>
       </w:r>
     </w:p>
     <w:p>
       <w:pPr>
+        <w:keepLines/>
         <w:tabs>
-          <w:tab w:pos="8986" w:val="right" w:leader="dot"/>
+          <w:tab w:pos="8731" w:val="right" w:leader="dot"/>
         </w:tabs>
         <w:spacing w:before="0" w:after="0" w:line="240" w:lineRule="auto"/>
-        <w:ind w:left="255" w:firstLine="0"/>
+        <w:ind w:left="312" w:firstLine="0"/>
       </w:pPr>
       <w:r>
         <w:rPr>
-          <w:rFonts w:ascii="Times New Roman" w:hAnsi="Times New Roman" w:eastAsia="Times New Roman"/>
-          <w:b w:val="0"/>
+          <w:rFonts w:ascii="Times New Roman" w:hAnsi="Times New Roman"/>
+          <w:sz w:val="18"/>
         </w:rPr>
-        <w:t>5.4. Sloj poslovne logike - realizacija poslovnog pravila</w:t>
+        <w:t>6.1. Realizacija korisničkih softverskih funkcija</w:t>
+        <w:tab/>
+        <w:t>27</w:t>
+      </w:r>
+      <w:r>
+        <w:rPr>
+          <w:rFonts w:ascii="Times New Roman" w:hAnsi="Times New Roman"/>
+          <w:sz w:val="18"/>
+        </w:rPr>
+      </w:r>
+    </w:p>
+    <w:p>
+      <w:pPr>
+        <w:keepLines/>
+        <w:tabs>
+          <w:tab w:pos="8731" w:val="right" w:leader="dot"/>
+        </w:tabs>
+        <w:spacing w:before="0" w:after="0" w:line="240" w:lineRule="auto"/>
+        <w:ind w:left="624" w:firstLine="0"/>
+      </w:pPr>
+      <w:r>
+        <w:rPr>
+          <w:rFonts w:ascii="Times New Roman" w:hAnsi="Times New Roman"/>
+          <w:sz w:val="18"/>
+        </w:rPr>
+        <w:t>6.1.1. Prijava korisnika</w:t>
+        <w:tab/>
+        <w:t>27</w:t>
+      </w:r>
+      <w:r>
+        <w:rPr>
+          <w:rFonts w:ascii="Times New Roman" w:hAnsi="Times New Roman"/>
+          <w:sz w:val="18"/>
+        </w:rPr>
+      </w:r>
+    </w:p>
+    <w:p>
+      <w:pPr>
+        <w:keepLines/>
+        <w:tabs>
+          <w:tab w:pos="8731" w:val="right" w:leader="dot"/>
+        </w:tabs>
+        <w:spacing w:before="0" w:after="0" w:line="240" w:lineRule="auto"/>
+        <w:ind w:left="624" w:firstLine="0"/>
+      </w:pPr>
+      <w:r>
+        <w:rPr>
+          <w:rFonts w:ascii="Times New Roman" w:hAnsi="Times New Roman"/>
+          <w:sz w:val="18"/>
+        </w:rPr>
+        <w:t>6.1.2. CRUD operacije nad glavnom tabelom</w:t>
         <w:tab/>
         <w:t>28</w:t>
       </w:r>
       <w:r>
         <w:rPr>
-          <w:rFonts w:ascii="Times New Roman" w:hAnsi="Times New Roman" w:eastAsia="Times New Roman"/>
-          <w:b w:val="0"/>
-        </w:rPr>
-      </w:r>
-      <w:r>
-        <w:rPr>
-          <w:rFonts w:ascii="Times New Roman" w:hAnsi="Times New Roman" w:eastAsia="Times New Roman"/>
-          <w:b w:val="0"/>
+          <w:rFonts w:ascii="Times New Roman" w:hAnsi="Times New Roman"/>
+          <w:sz w:val="18"/>
         </w:rPr>
       </w:r>
     </w:p>
     <w:p>
       <w:pPr>
+        <w:keepLines/>
         <w:tabs>
-          <w:tab w:pos="8986" w:val="right" w:leader="dot"/>
+          <w:tab w:pos="8731" w:val="right" w:leader="dot"/>
         </w:tabs>
         <w:spacing w:before="0" w:after="0" w:line="240" w:lineRule="auto"/>
-        <w:ind w:left="255" w:firstLine="0"/>
+        <w:ind w:left="624" w:firstLine="0"/>
       </w:pPr>
       <w:r>
         <w:rPr>
-          <w:rFonts w:ascii="Times New Roman" w:hAnsi="Times New Roman" w:eastAsia="Times New Roman"/>
-          <w:b w:val="0"/>
+          <w:rFonts w:ascii="Times New Roman" w:hAnsi="Times New Roman"/>
+          <w:sz w:val="18"/>
         </w:rPr>
-        <w:t>5.5. Sloj servisa - realizacija REST servisa</w:t>
+        <w:t>6.1.3. Štampa, filtrirana štampa i pojedinačna parametarska štampa</w:t>
         <w:tab/>
-        <w:t>30</w:t>
+        <w:t>31</w:t>
       </w:r>
       <w:r>
         <w:rPr>
-          <w:rFonts w:ascii="Times New Roman" w:hAnsi="Times New Roman" w:eastAsia="Times New Roman"/>
-          <w:b w:val="0"/>
-        </w:rPr>
-      </w:r>
-      <w:r>
-        <w:rPr>
-          <w:rFonts w:ascii="Times New Roman" w:hAnsi="Times New Roman" w:eastAsia="Times New Roman"/>
-          <w:b w:val="0"/>
+          <w:rFonts w:ascii="Times New Roman" w:hAnsi="Times New Roman"/>
+          <w:sz w:val="18"/>
         </w:rPr>
       </w:r>
     </w:p>
     <w:p>
       <w:pPr>
+        <w:keepLines/>
         <w:tabs>
-          <w:tab w:pos="8986" w:val="right" w:leader="dot"/>
+          <w:tab w:pos="8731" w:val="right" w:leader="dot"/>
         </w:tabs>
         <w:spacing w:before="0" w:after="0" w:line="240" w:lineRule="auto"/>
-        <w:ind w:left="255" w:firstLine="0"/>
+        <w:ind w:left="312" w:firstLine="0"/>
       </w:pPr>
       <w:r>
         <w:rPr>
-          <w:rFonts w:ascii="Times New Roman" w:hAnsi="Times New Roman" w:eastAsia="Times New Roman"/>
-          <w:b w:val="0"/>
+          <w:rFonts w:ascii="Times New Roman" w:hAnsi="Times New Roman"/>
+          <w:sz w:val="18"/>
         </w:rPr>
-        <w:t>5.6. Sloj za rad sa podacima</w:t>
+        <w:t>6.2. Realizacija osnovnih validacija</w:t>
+        <w:tab/>
+        <w:t>31</w:t>
+      </w:r>
+      <w:r>
+        <w:rPr>
+          <w:rFonts w:ascii="Times New Roman" w:hAnsi="Times New Roman"/>
+          <w:sz w:val="18"/>
+        </w:rPr>
+      </w:r>
+    </w:p>
+    <w:p>
+      <w:pPr>
+        <w:keepLines/>
+        <w:tabs>
+          <w:tab w:pos="8731" w:val="right" w:leader="dot"/>
+        </w:tabs>
+        <w:spacing w:before="0" w:after="0" w:line="240" w:lineRule="auto"/>
+        <w:ind w:left="312" w:firstLine="0"/>
+      </w:pPr>
+      <w:r>
+        <w:rPr>
+          <w:rFonts w:ascii="Times New Roman" w:hAnsi="Times New Roman"/>
+          <w:sz w:val="18"/>
+        </w:rPr>
+        <w:t>6.3. Prezentacioni sloj - realizacija MVC i ViewModel-a</w:t>
         <w:tab/>
         <w:t>34</w:t>
       </w:r>
       <w:r>
         <w:rPr>
-          <w:rFonts w:ascii="Times New Roman" w:hAnsi="Times New Roman" w:eastAsia="Times New Roman"/>
-          <w:b w:val="0"/>
-        </w:rPr>
-      </w:r>
-      <w:r>
-        <w:rPr>
-          <w:rFonts w:ascii="Times New Roman" w:hAnsi="Times New Roman" w:eastAsia="Times New Roman"/>
-          <w:b w:val="0"/>
+          <w:rFonts w:ascii="Times New Roman" w:hAnsi="Times New Roman"/>
+          <w:sz w:val="18"/>
         </w:rPr>
       </w:r>
     </w:p>
     <w:p>
       <w:pPr>
+        <w:keepLines/>
         <w:tabs>
-          <w:tab w:pos="8986" w:val="right" w:leader="dot"/>
+          <w:tab w:pos="8731" w:val="right" w:leader="dot"/>
         </w:tabs>
         <w:spacing w:before="0" w:after="0" w:line="240" w:lineRule="auto"/>
-        <w:ind w:left="510" w:firstLine="0"/>
+        <w:ind w:left="312" w:firstLine="0"/>
       </w:pPr>
       <w:r>
         <w:rPr>
-          <w:rFonts w:ascii="Times New Roman" w:hAnsi="Times New Roman" w:eastAsia="Times New Roman"/>
-          <w:b w:val="0"/>
+          <w:rFonts w:ascii="Times New Roman" w:hAnsi="Times New Roman"/>
+          <w:sz w:val="18"/>
         </w:rPr>
-        <w:t>5.6.1. Repository Pattern</w:t>
-        <w:tab/>
-        <w:t>34</w:t>
-      </w:r>
-      <w:r>
-        <w:rPr>
-          <w:rFonts w:ascii="Times New Roman" w:hAnsi="Times New Roman" w:eastAsia="Times New Roman"/>
-          <w:b w:val="0"/>
-        </w:rPr>
-      </w:r>
-      <w:r>
-        <w:rPr>
-          <w:rFonts w:ascii="Times New Roman" w:hAnsi="Times New Roman" w:eastAsia="Times New Roman"/>
-          <w:b w:val="0"/>
-        </w:rPr>
-      </w:r>
-    </w:p>
-    <w:p>
-      <w:pPr>
-        <w:tabs>
-          <w:tab w:pos="8986" w:val="right" w:leader="dot"/>
-        </w:tabs>
-        <w:spacing w:before="0" w:after="0" w:line="240" w:lineRule="auto"/>
-        <w:ind w:left="510" w:firstLine="0"/>
-      </w:pPr>
-      <w:r>
-        <w:rPr>
-          <w:rFonts w:ascii="Times New Roman" w:hAnsi="Times New Roman" w:eastAsia="Times New Roman"/>
-          <w:b w:val="0"/>
-        </w:rPr>
-        <w:t>5.6.2. Rad sa stored procedurama</w:t>
+        <w:t>6.4. Sloj poslovne logike - realizacija poslovnog pravila</w:t>
         <w:tab/>
         <w:t>35</w:t>
       </w:r>
       <w:r>
         <w:rPr>
-          <w:rFonts w:ascii="Times New Roman" w:hAnsi="Times New Roman" w:eastAsia="Times New Roman"/>
-          <w:b w:val="0"/>
-        </w:rPr>
-      </w:r>
-      <w:r>
-        <w:rPr>
-          <w:rFonts w:ascii="Times New Roman" w:hAnsi="Times New Roman" w:eastAsia="Times New Roman"/>
-          <w:b w:val="0"/>
+          <w:rFonts w:ascii="Times New Roman" w:hAnsi="Times New Roman"/>
+          <w:sz w:val="18"/>
         </w:rPr>
       </w:r>
     </w:p>
     <w:p>
       <w:pPr>
+        <w:keepLines/>
         <w:tabs>
-          <w:tab w:pos="8986" w:val="right" w:leader="dot"/>
+          <w:tab w:pos="8731" w:val="right" w:leader="dot"/>
         </w:tabs>
         <w:spacing w:before="0" w:after="0" w:line="240" w:lineRule="auto"/>
-        <w:ind w:left="510" w:firstLine="0"/>
+        <w:ind w:left="312" w:firstLine="0"/>
       </w:pPr>
       <w:r>
         <w:rPr>
-          <w:rFonts w:ascii="Times New Roman" w:hAnsi="Times New Roman" w:eastAsia="Times New Roman"/>
-          <w:b w:val="0"/>
+          <w:rFonts w:ascii="Times New Roman" w:hAnsi="Times New Roman"/>
+          <w:sz w:val="18"/>
         </w:rPr>
-        <w:t>5.6.3. Rad sa DBUtils i primena upita</w:t>
+        <w:t>6.5. Sloj servisa - realizacija REST servisa</w:t>
         <w:tab/>
-        <w:t>35</w:t>
+        <w:t>36</w:t>
       </w:r>
       <w:r>
         <w:rPr>
-          <w:rFonts w:ascii="Times New Roman" w:hAnsi="Times New Roman" w:eastAsia="Times New Roman"/>
-          <w:b w:val="0"/>
-        </w:rPr>
-      </w:r>
-      <w:r>
-        <w:rPr>
-          <w:rFonts w:ascii="Times New Roman" w:hAnsi="Times New Roman" w:eastAsia="Times New Roman"/>
-          <w:b w:val="0"/>
+          <w:rFonts w:ascii="Times New Roman" w:hAnsi="Times New Roman"/>
+          <w:sz w:val="18"/>
         </w:rPr>
       </w:r>
     </w:p>
     <w:p>
       <w:pPr>
+        <w:keepLines/>
         <w:tabs>
-          <w:tab w:pos="8986" w:val="right" w:leader="dot"/>
+          <w:tab w:pos="8731" w:val="right" w:leader="dot"/>
         </w:tabs>
         <w:spacing w:before="0" w:after="0" w:line="240" w:lineRule="auto"/>
-        <w:ind w:left="510" w:firstLine="0"/>
+        <w:ind w:left="312" w:firstLine="0"/>
       </w:pPr>
       <w:r>
         <w:rPr>
-          <w:rFonts w:ascii="Times New Roman" w:hAnsi="Times New Roman" w:eastAsia="Times New Roman"/>
-          <w:b w:val="0"/>
+          <w:rFonts w:ascii="Times New Roman" w:hAnsi="Times New Roman"/>
+          <w:sz w:val="18"/>
         </w:rPr>
-        <w:t>5.6.4. Rad sa Entity Framework klasama</w:t>
+        <w:t>6.6. Sloj za rad sa podacima</w:t>
         <w:tab/>
-        <w:t>37</w:t>
+        <w:t>40</w:t>
       </w:r>
       <w:r>
         <w:rPr>
-          <w:rFonts w:ascii="Times New Roman" w:hAnsi="Times New Roman" w:eastAsia="Times New Roman"/>
-          <w:b w:val="0"/>
-        </w:rPr>
-      </w:r>
-      <w:r>
-        <w:rPr>
-          <w:rFonts w:ascii="Times New Roman" w:hAnsi="Times New Roman" w:eastAsia="Times New Roman"/>
-          <w:b w:val="0"/>
+          <w:rFonts w:ascii="Times New Roman" w:hAnsi="Times New Roman"/>
+          <w:sz w:val="18"/>
         </w:rPr>
       </w:r>
     </w:p>
     <w:p>
       <w:pPr>
+        <w:keepLines/>
         <w:tabs>
-          <w:tab w:pos="8986" w:val="right" w:leader="dot"/>
+          <w:tab w:pos="8731" w:val="right" w:leader="dot"/>
         </w:tabs>
         <w:spacing w:before="0" w:after="0" w:line="240" w:lineRule="auto"/>
-        <w:ind w:left="255" w:firstLine="0"/>
+        <w:ind w:left="624" w:firstLine="0"/>
       </w:pPr>
       <w:r>
         <w:rPr>
-          <w:rFonts w:ascii="Times New Roman" w:hAnsi="Times New Roman" w:eastAsia="Times New Roman"/>
-          <w:b w:val="0"/>
+          <w:rFonts w:ascii="Times New Roman" w:hAnsi="Times New Roman"/>
+          <w:sz w:val="18"/>
         </w:rPr>
-        <w:t>5.7. Realizacija master-detail unosa sa transakcijom i tabelarnog prikaza</w:t>
+        <w:t>6.6.1. Repository Pattern</w:t>
         <w:tab/>
-        <w:t>38</w:t>
+        <w:t>40</w:t>
       </w:r>
       <w:r>
         <w:rPr>
-          <w:rFonts w:ascii="Times New Roman" w:hAnsi="Times New Roman" w:eastAsia="Times New Roman"/>
-          <w:b w:val="0"/>
-        </w:rPr>
-      </w:r>
-      <w:r>
-        <w:rPr>
-          <w:rFonts w:ascii="Times New Roman" w:hAnsi="Times New Roman" w:eastAsia="Times New Roman"/>
-          <w:b w:val="0"/>
+          <w:rFonts w:ascii="Times New Roman" w:hAnsi="Times New Roman"/>
+          <w:sz w:val="18"/>
         </w:rPr>
       </w:r>
     </w:p>
     <w:p>
       <w:pPr>
+        <w:keepLines/>
         <w:tabs>
-          <w:tab w:pos="8986" w:val="right" w:leader="dot"/>
+          <w:tab w:pos="8731" w:val="right" w:leader="dot"/>
         </w:tabs>
         <w:spacing w:before="0" w:after="0" w:line="240" w:lineRule="auto"/>
-        <w:ind w:left="255" w:firstLine="0"/>
+        <w:ind w:left="624" w:firstLine="0"/>
       </w:pPr>
       <w:r>
         <w:rPr>
-          <w:rFonts w:ascii="Times New Roman" w:hAnsi="Times New Roman" w:eastAsia="Times New Roman"/>
-          <w:b w:val="0"/>
+          <w:rFonts w:ascii="Times New Roman" w:hAnsi="Times New Roman"/>
+          <w:sz w:val="18"/>
         </w:rPr>
-        <w:t>5.8. JavaScript validacije i regularni izrazi</w:t>
-        <w:tab/>
-        <w:t>39</w:t>
-      </w:r>
-      <w:r>
-        <w:rPr>
-          <w:rFonts w:ascii="Times New Roman" w:hAnsi="Times New Roman" w:eastAsia="Times New Roman"/>
-          <w:b w:val="0"/>
-        </w:rPr>
-      </w:r>
-      <w:r>
-        <w:rPr>
-          <w:rFonts w:ascii="Times New Roman" w:hAnsi="Times New Roman" w:eastAsia="Times New Roman"/>
-          <w:b w:val="0"/>
-        </w:rPr>
-      </w:r>
-    </w:p>
-    <w:p>
-      <w:pPr>
-        <w:tabs>
-          <w:tab w:pos="8986" w:val="right" w:leader="dot"/>
-        </w:tabs>
-        <w:spacing w:before="0" w:after="0" w:line="240" w:lineRule="auto"/>
-        <w:ind w:left="0" w:firstLine="0"/>
-      </w:pPr>
-      <w:r>
-        <w:rPr>
-          <w:rFonts w:ascii="Times New Roman" w:hAnsi="Times New Roman" w:eastAsia="Times New Roman"/>
-          <w:b w:val="0"/>
-        </w:rPr>
-        <w:t>6. Zaključak</w:t>
+        <w:t>6.6.2. Rad sa stored procedurama</w:t>
         <w:tab/>
         <w:t>41</w:t>
       </w:r>
       <w:r>
         <w:rPr>
-          <w:rFonts w:ascii="Times New Roman" w:hAnsi="Times New Roman" w:eastAsia="Times New Roman"/>
-          <w:b w:val="0"/>
-        </w:rPr>
-      </w:r>
-      <w:r>
-        <w:rPr>
-          <w:rFonts w:ascii="Times New Roman" w:hAnsi="Times New Roman" w:eastAsia="Times New Roman"/>
-          <w:b w:val="0"/>
+          <w:rFonts w:ascii="Times New Roman" w:hAnsi="Times New Roman"/>
+          <w:sz w:val="18"/>
         </w:rPr>
       </w:r>
     </w:p>
     <w:p>
       <w:pPr>
+        <w:keepLines/>
         <w:tabs>
-          <w:tab w:pos="8986" w:val="right" w:leader="dot"/>
+          <w:tab w:pos="8731" w:val="right" w:leader="dot"/>
         </w:tabs>
         <w:spacing w:before="0" w:after="0" w:line="240" w:lineRule="auto"/>
-        <w:ind w:left="0" w:firstLine="0"/>
+        <w:ind w:left="624" w:firstLine="0"/>
       </w:pPr>
       <w:r>
         <w:rPr>
-          <w:rFonts w:ascii="Times New Roman" w:hAnsi="Times New Roman" w:eastAsia="Times New Roman"/>
-          <w:b w:val="0"/>
+          <w:rFonts w:ascii="Times New Roman" w:hAnsi="Times New Roman"/>
+          <w:sz w:val="18"/>
         </w:rPr>
-        <w:t>7. Literatura</w:t>
+        <w:t>6.6.3. Rad sa DBUtils i primena upita</w:t>
         <w:tab/>
         <w:t>41</w:t>
       </w:r>
       <w:r>
         <w:rPr>
-          <w:rFonts w:ascii="Times New Roman" w:hAnsi="Times New Roman" w:eastAsia="Times New Roman"/>
-          <w:b w:val="0"/>
-        </w:rPr>
-      </w:r>
-      <w:r>
-        <w:rPr>
-          <w:rFonts w:ascii="Times New Roman" w:hAnsi="Times New Roman" w:eastAsia="Times New Roman"/>
-          <w:b w:val="0"/>
+          <w:rFonts w:ascii="Times New Roman" w:hAnsi="Times New Roman"/>
+          <w:sz w:val="18"/>
         </w:rPr>
       </w:r>
     </w:p>
     <w:p>
+      <w:pPr>
+        <w:keepLines/>
+        <w:tabs>
+          <w:tab w:pos="8731" w:val="right" w:leader="dot"/>
+        </w:tabs>
+        <w:spacing w:before="0" w:after="0" w:line="240" w:lineRule="auto"/>
+        <w:ind w:left="624" w:firstLine="0"/>
+      </w:pPr>
       <w:r>
-        <w:br w:type="page"/>
+        <w:rPr>
+          <w:rFonts w:ascii="Times New Roman" w:hAnsi="Times New Roman"/>
+          <w:sz w:val="18"/>
+        </w:rPr>
+        <w:t>6.6.4. Rad sa Entity Framework klasama</w:t>
+        <w:tab/>
+        <w:t>42</w:t>
+      </w:r>
+      <w:r>
+        <w:rPr>
+          <w:rFonts w:ascii="Times New Roman" w:hAnsi="Times New Roman"/>
+          <w:sz w:val="18"/>
+        </w:rPr>
       </w:r>
     </w:p>
     <w:p>
       <w:pPr>
+        <w:keepLines/>
+        <w:tabs>
+          <w:tab w:pos="8731" w:val="right" w:leader="dot"/>
+        </w:tabs>
+        <w:spacing w:before="0" w:after="0" w:line="240" w:lineRule="auto"/>
+        <w:ind w:left="312" w:firstLine="0"/>
+      </w:pPr>
+      <w:r>
+        <w:rPr>
+          <w:rFonts w:ascii="Times New Roman" w:hAnsi="Times New Roman"/>
+          <w:sz w:val="18"/>
+        </w:rPr>
+        <w:t>6.7. Realizacija master-detail unosa sa transakcijom i tabelarnog prikaza</w:t>
+        <w:tab/>
+        <w:t>44</w:t>
+      </w:r>
+      <w:r>
+        <w:rPr>
+          <w:rFonts w:ascii="Times New Roman" w:hAnsi="Times New Roman"/>
+          <w:sz w:val="18"/>
+        </w:rPr>
+      </w:r>
+    </w:p>
+    <w:p>
+      <w:pPr>
+        <w:keepLines/>
+        <w:tabs>
+          <w:tab w:pos="8731" w:val="right" w:leader="dot"/>
+        </w:tabs>
+        <w:spacing w:before="0" w:after="0" w:line="240" w:lineRule="auto"/>
+        <w:ind w:left="312" w:firstLine="0"/>
+      </w:pPr>
+      <w:r>
+        <w:rPr>
+          <w:rFonts w:ascii="Times New Roman" w:hAnsi="Times New Roman"/>
+          <w:sz w:val="18"/>
+        </w:rPr>
+        <w:t>6.8. JavaScript validacije i regularni izrazi</w:t>
+        <w:tab/>
+        <w:t>45</w:t>
+      </w:r>
+      <w:r>
+        <w:rPr>
+          <w:rFonts w:ascii="Times New Roman" w:hAnsi="Times New Roman"/>
+          <w:sz w:val="18"/>
+        </w:rPr>
+      </w:r>
+    </w:p>
+    <w:p>
+      <w:pPr>
+        <w:keepLines/>
+        <w:tabs>
+          <w:tab w:pos="8731" w:val="right" w:leader="dot"/>
+        </w:tabs>
+        <w:spacing w:before="0" w:after="0" w:line="240" w:lineRule="auto"/>
+        <w:ind w:left="0" w:firstLine="0"/>
+      </w:pPr>
+      <w:r>
+        <w:rPr>
+          <w:rFonts w:ascii="Times New Roman" w:hAnsi="Times New Roman"/>
+          <w:sz w:val="18"/>
+        </w:rPr>
+        <w:t>7. Zaključak</w:t>
+        <w:tab/>
+        <w:t>47</w:t>
+      </w:r>
+      <w:r>
+        <w:rPr>
+          <w:rFonts w:ascii="Times New Roman" w:hAnsi="Times New Roman"/>
+          <w:sz w:val="18"/>
+        </w:rPr>
+      </w:r>
+    </w:p>
+    <w:p>
+      <w:pPr>
+        <w:keepLines/>
+        <w:tabs>
+          <w:tab w:pos="8731" w:val="right" w:leader="dot"/>
+        </w:tabs>
+        <w:spacing w:before="0" w:after="0" w:line="240" w:lineRule="auto"/>
+        <w:ind w:left="0" w:firstLine="0"/>
+      </w:pPr>
+      <w:r>
+        <w:rPr>
+          <w:rFonts w:ascii="Times New Roman" w:hAnsi="Times New Roman"/>
+          <w:sz w:val="18"/>
+        </w:rPr>
+        <w:t>8. Literatura</w:t>
+        <w:tab/>
+        <w:t>48</w:t>
+      </w:r>
+      <w:r>
+        <w:rPr>
+          <w:rFonts w:ascii="Times New Roman" w:hAnsi="Times New Roman"/>
+          <w:sz w:val="18"/>
+        </w:rPr>
+      </w:r>
+    </w:p>
+    <w:p>
+      <w:pPr>
         <w:pStyle w:val="Heading1"/>
         <w:keepNext/>
+        <w:pageBreakBefore/>
         <w:spacing w:before="160" w:after="100"/>
       </w:pPr>
       <w:r>
@@ -1445,6 +1511,7 @@
       <w:pPr>
         <w:pStyle w:val="Heading1"/>
         <w:keepNext/>
+        <w:pageBreakBefore/>
         <w:spacing w:before="160" w:after="100"/>
       </w:pPr>
       <w:r>
@@ -6284,7 +6351,1054 @@
     <w:p>
       <w:pPr>
         <w:pStyle w:val="Heading1"/>
+        <w:pageBreakBefore/>
+      </w:pPr>
+      <w:r>
+        <w:t>3. Korisničko uputstvo</w:t>
+      </w:r>
+    </w:p>
+    <w:p>
+      <w:pPr/>
+      <w:r>
+        <w:t>Ovo poglavlje je namenjeno krajnjem korisniku aplikacije. Koraci su navedeni redosledom kojim se sistem priprema, pokreće i koristi; tehnički isečci izvornog koda izdvojeni su u poglavlju 6.</w:t>
+      </w:r>
+    </w:p>
+    <w:p>
+      <w:pPr>
+        <w:pStyle w:val="Heading2"/>
+      </w:pPr>
+      <w:r>
+        <w:t>3.1. Preduslovi i pokretanje aplikacije</w:t>
+      </w:r>
+    </w:p>
+    <w:p>
+      <w:pPr/>
+      <w:r>
+        <w:t>Za lokalno pokretanje potrebni su Windows 10 ili 11, Visual Studio 2022 sa komponentom ASP.NET and web development, SQL Server LocalDB i .NET Framework 4.7.2 Developer Pack.</w:t>
+      </w:r>
+    </w:p>
+    <w:p>
+      <w:pPr>
+        <w:pStyle w:val="ListNumber"/>
+        <w:keepNext w:val="0"/>
+        <w:keepLines/>
+      </w:pPr>
+      <w:r>
+        <w:t>Pokrenuti SQL skriptu 1_SlojPodataka/BazaPodataka/InstalacijaBaze.sql kako bi se napravila i inicijalizovala baza SportskiKlubRVS.</w:t>
+      </w:r>
+    </w:p>
+    <w:p>
+      <w:pPr>
+        <w:pStyle w:val="ListNumber"/>
+        <w:keepNext w:val="0"/>
+        <w:keepLines/>
+      </w:pPr>
+      <w:r>
+        <w:t>Otvoriti rešenje 4_PrezentacioniSloj/KorisnickiInterfejs/KorisnickiInterfejs.sln u Visual Studio-u, zatim izvršiti Restore NuGet Packages, Clean Solution i Rebuild Solution.</w:t>
+      </w:r>
+    </w:p>
+    <w:p>
+      <w:pPr>
+        <w:pStyle w:val="ListNumber"/>
+        <w:keepNext w:val="0"/>
+        <w:keepLines/>
+      </w:pPr>
+      <w:r>
+        <w:t>U svojstvima rešenja izabrati Multiple startup projects i postaviti RESTServis i KorisnickiInterfejs na Start.</w:t>
+      </w:r>
+    </w:p>
+    <w:p>
+      <w:pPr>
+        <w:pStyle w:val="ListNumber"/>
+        <w:keepNext w:val="0"/>
+        <w:keepLines/>
+      </w:pPr>
+      <w:r>
+        <w:t>Pokrenuti rešenje. REST servis je dostupan na https://localhost:44346/, a korisnički interfejs na https://localhost:44334/.</w:t>
+      </w:r>
+    </w:p>
+    <w:p>
+      <w:r>
+        <w:br w:type="page"/>
+      </w:r>
+    </w:p>
+    <w:p>
+      <w:pPr>
+        <w:pStyle w:val="Heading2"/>
+      </w:pPr>
+      <w:r>
+        <w:t>3.2. Prijava, uloge i odjava</w:t>
+      </w:r>
+    </w:p>
+    <w:p>
+      <w:pPr/>
+      <w:r>
+        <w:t>Na stranici za prijavu unose se korisničko ime i lozinka. Za demonstraciju su dostupni nalozi admin / admin123 i referent / referent123. Administrator ima i pravo brisanja, dok referent može da pregleda, unosi, menja, obrađuje, filtrira i štampa zahteve. Komanda Odjava završava korisničku sesiju i vraća korisnika na prijavu.</w:t>
+      </w:r>
+    </w:p>
+    <w:p>
+      <w:pPr>
         <w:keepNext/>
+        <w:spacing w:after="20"/>
+        <w:jc w:val="center"/>
+      </w:pPr>
+      <w:r>
+        <w:drawing>
+          <wp:inline xmlns:a="http://schemas.openxmlformats.org/drawingml/2006/main" xmlns:pic="http://schemas.openxmlformats.org/drawingml/2006/picture">
+            <wp:extent cx="5472000" cy="4009000"/>
+            <wp:docPr id="10" name="Picture 10" descr="Stranica za prijavu korisnika"/>
+            <wp:cNvGraphicFramePr>
+              <a:graphicFrameLocks noChangeAspect="1"/>
+            </wp:cNvGraphicFramePr>
+            <a:graphic>
+              <a:graphicData uri="http://schemas.openxmlformats.org/drawingml/2006/picture">
+                <pic:pic>
+                  <pic:nvPicPr>
+                    <pic:cNvPr id="0" name="01-prijava.png"/>
+                    <pic:cNvPicPr/>
+                  </pic:nvPicPr>
+                  <pic:blipFill>
+                    <a:blip r:embed="rId19"/>
+                    <a:stretch>
+                      <a:fillRect/>
+                    </a:stretch>
+                  </pic:blipFill>
+                  <pic:spPr>
+                    <a:xfrm>
+                      <a:off x="0" y="0"/>
+                      <a:ext cx="5472000" cy="4009000"/>
+                    </a:xfrm>
+                    <a:prstGeom prst="rect"/>
+                  </pic:spPr>
+                </pic:pic>
+              </a:graphicData>
+            </a:graphic>
+          </wp:inline>
+        </w:drawing>
+      </w:r>
+    </w:p>
+    <w:p>
+      <w:pPr>
+        <w:keepNext w:val="0"/>
+        <w:keepLines/>
+        <w:spacing w:before="40" w:after="160"/>
+        <w:jc w:val="center"/>
+      </w:pPr>
+      <w:r>
+        <w:rPr>
+          <w:rFonts w:ascii="Times New Roman" w:hAnsi="Times New Roman" w:eastAsia="Times New Roman"/>
+          <w:b w:val="0"/>
+          <w:i/>
+          <w:sz w:val="18"/>
+        </w:rPr>
+        <w:t>Slika 2. Stranica za prijavu ovlašćenog korisnika</w:t>
+      </w:r>
+    </w:p>
+    <w:p>
+      <w:pPr/>
+      <w:r>
+        <w:t>Posle uspešne prijave otvara se početna stranica. Ako podaci nisu ispravni, sesija se ne formira i prikazuje se kontrolisana poruka.</w:t>
+      </w:r>
+    </w:p>
+    <w:p>
+      <w:pPr>
+        <w:keepNext/>
+        <w:spacing w:after="20"/>
+        <w:jc w:val="center"/>
+      </w:pPr>
+      <w:r>
+        <w:drawing>
+          <wp:inline xmlns:a="http://schemas.openxmlformats.org/drawingml/2006/main" xmlns:pic="http://schemas.openxmlformats.org/drawingml/2006/picture">
+            <wp:extent cx="5159431" cy="3780000"/>
+            <wp:docPr id="11" name="Picture 11" descr="Neuspešna prijava korisnika"/>
+            <wp:cNvGraphicFramePr>
+              <a:graphicFrameLocks noChangeAspect="1"/>
+            </wp:cNvGraphicFramePr>
+            <a:graphic>
+              <a:graphicData uri="http://schemas.openxmlformats.org/drawingml/2006/picture">
+                <pic:pic>
+                  <pic:nvPicPr>
+                    <pic:cNvPr id="0" name="02-pogresna-prijava.png"/>
+                    <pic:cNvPicPr/>
+                  </pic:nvPicPr>
+                  <pic:blipFill>
+                    <a:blip r:embed="rId20"/>
+                    <a:stretch>
+                      <a:fillRect/>
+                    </a:stretch>
+                  </pic:blipFill>
+                  <pic:spPr>
+                    <a:xfrm>
+                      <a:off x="0" y="0"/>
+                      <a:ext cx="5159431" cy="3780000"/>
+                    </a:xfrm>
+                    <a:prstGeom prst="rect"/>
+                  </pic:spPr>
+                </pic:pic>
+              </a:graphicData>
+            </a:graphic>
+          </wp:inline>
+        </w:drawing>
+      </w:r>
+    </w:p>
+    <w:p>
+      <w:pPr>
+        <w:keepNext w:val="0"/>
+        <w:keepLines/>
+        <w:spacing w:before="40" w:after="160"/>
+        <w:jc w:val="center"/>
+      </w:pPr>
+      <w:r>
+        <w:rPr>
+          <w:rFonts w:ascii="Times New Roman" w:hAnsi="Times New Roman" w:eastAsia="Times New Roman"/>
+          <w:b w:val="0"/>
+          <w:i/>
+          <w:sz w:val="18"/>
+        </w:rPr>
+        <w:t>Slika 3. Kontrolisana validacija neuspešne prijave</w:t>
+      </w:r>
+    </w:p>
+    <w:p>
+      <w:r>
+        <w:br w:type="page"/>
+      </w:r>
+    </w:p>
+    <w:p>
+      <w:pPr>
+        <w:pStyle w:val="Heading2"/>
+      </w:pPr>
+      <w:r>
+        <w:t>3.3. Pregled i filtriranje zahteva</w:t>
+      </w:r>
+    </w:p>
+    <w:p>
+      <w:pPr/>
+      <w:r>
+        <w:t>Iz menija Zahtevi otvara se centralni tabelarni prikaz. Za svaki zapis dostupni su detalji, izmena i pojedinačna štampa; administratoru je dostupno i brisanje.</w:t>
+      </w:r>
+    </w:p>
+    <w:p>
+      <w:pPr>
+        <w:keepNext/>
+        <w:spacing w:after="20"/>
+        <w:jc w:val="center"/>
+      </w:pPr>
+      <w:r>
+        <w:drawing>
+          <wp:inline xmlns:a="http://schemas.openxmlformats.org/drawingml/2006/main" xmlns:pic="http://schemas.openxmlformats.org/drawingml/2006/picture">
+            <wp:extent cx="4937142" cy="3600000"/>
+            <wp:docPr id="12" name="Picture 12" descr="Spisak zahteva"/>
+            <wp:cNvGraphicFramePr>
+              <a:graphicFrameLocks noChangeAspect="1"/>
+            </wp:cNvGraphicFramePr>
+            <a:graphic>
+              <a:graphicData uri="http://schemas.openxmlformats.org/drawingml/2006/picture">
+                <pic:pic>
+                  <pic:nvPicPr>
+                    <pic:cNvPr id="0" name="03-spisak-zahteva.png"/>
+                    <pic:cNvPicPr/>
+                  </pic:nvPicPr>
+                  <pic:blipFill>
+                    <a:blip r:embed="rId21"/>
+                    <a:stretch>
+                      <a:fillRect/>
+                    </a:stretch>
+                  </pic:blipFill>
+                  <pic:spPr>
+                    <a:xfrm>
+                      <a:off x="0" y="0"/>
+                      <a:ext cx="4937142" cy="3600000"/>
+                    </a:xfrm>
+                    <a:prstGeom prst="rect"/>
+                  </pic:spPr>
+                </pic:pic>
+              </a:graphicData>
+            </a:graphic>
+          </wp:inline>
+        </w:drawing>
+      </w:r>
+    </w:p>
+    <w:p>
+      <w:pPr>
+        <w:keepNext w:val="0"/>
+        <w:keepLines/>
+        <w:spacing w:before="40" w:after="160"/>
+        <w:jc w:val="center"/>
+      </w:pPr>
+      <w:r>
+        <w:rPr>
+          <w:rFonts w:ascii="Times New Roman" w:hAnsi="Times New Roman" w:eastAsia="Times New Roman"/>
+          <w:b w:val="0"/>
+          <w:i/>
+          <w:sz w:val="18"/>
+        </w:rPr>
+        <w:t>Slika 4. Tabelarni prikaz zahteva za učlanjivanje</w:t>
+      </w:r>
+    </w:p>
+    <w:p>
+      <w:pPr/>
+      <w:r>
+        <w:t>Filter prihvata broj zahteva, JMBG, ime, prezime, sportsku disciplinu ili status. Dugme Pretraži prikazuje samo odgovarajuće zapise, a poništavanje kriterijuma vraća kompletan spisak.</w:t>
+      </w:r>
+    </w:p>
+    <w:p>
+      <w:pPr>
+        <w:keepNext/>
+        <w:spacing w:after="20"/>
+        <w:jc w:val="center"/>
+      </w:pPr>
+      <w:r>
+        <w:drawing>
+          <wp:inline xmlns:a="http://schemas.openxmlformats.org/drawingml/2006/main" xmlns:pic="http://schemas.openxmlformats.org/drawingml/2006/picture">
+            <wp:extent cx="4937142" cy="3600000"/>
+            <wp:docPr id="13" name="Picture 13" descr="Filtriran spisak zahteva"/>
+            <wp:cNvGraphicFramePr>
+              <a:graphicFrameLocks noChangeAspect="1"/>
+            </wp:cNvGraphicFramePr>
+            <a:graphic>
+              <a:graphicData uri="http://schemas.openxmlformats.org/drawingml/2006/picture">
+                <pic:pic>
+                  <pic:nvPicPr>
+                    <pic:cNvPr id="0" name="04-filtriranje-zahteva.png"/>
+                    <pic:cNvPicPr/>
+                  </pic:nvPicPr>
+                  <pic:blipFill>
+                    <a:blip r:embed="rId22"/>
+                    <a:stretch>
+                      <a:fillRect/>
+                    </a:stretch>
+                  </pic:blipFill>
+                  <pic:spPr>
+                    <a:xfrm>
+                      <a:off x="0" y="0"/>
+                      <a:ext cx="4937142" cy="3600000"/>
+                    </a:xfrm>
+                    <a:prstGeom prst="rect"/>
+                  </pic:spPr>
+                </pic:pic>
+              </a:graphicData>
+            </a:graphic>
+          </wp:inline>
+        </w:drawing>
+      </w:r>
+    </w:p>
+    <w:p>
+      <w:pPr>
+        <w:keepNext w:val="0"/>
+        <w:keepLines/>
+        <w:spacing w:before="40" w:after="160"/>
+        <w:jc w:val="center"/>
+      </w:pPr>
+      <w:r>
+        <w:rPr>
+          <w:rFonts w:ascii="Times New Roman" w:hAnsi="Times New Roman" w:eastAsia="Times New Roman"/>
+          <w:b w:val="0"/>
+          <w:i/>
+          <w:sz w:val="18"/>
+        </w:rPr>
+        <w:t>Slika 5. Rezultat filtriranja spiska zahteva</w:t>
+      </w:r>
+    </w:p>
+    <w:p>
+      <w:r>
+        <w:br w:type="page"/>
+      </w:r>
+    </w:p>
+    <w:p>
+      <w:pPr>
+        <w:pStyle w:val="Heading2"/>
+      </w:pPr>
+      <w:r>
+        <w:t>3.4. Unos, validacija i izmena zahteva</w:t>
+      </w:r>
+    </w:p>
+    <w:p>
+      <w:pPr/>
+      <w:r>
+        <w:t>Komanda Novi zahtev otvara jednu formu za podatke kandidata, zahtev, sportsku disciplinu, rezultat testa, dokumentaciju i, kada je kandidat maloletan, roditelja ili staratelja. Polja označena kao obavezna moraju biti popunjena pre čuvanja.</w:t>
+      </w:r>
+    </w:p>
+    <w:p>
+      <w:pPr>
+        <w:keepNext/>
+        <w:spacing w:after="20"/>
+        <w:jc w:val="center"/>
+      </w:pPr>
+      <w:r>
+        <w:drawing>
+          <wp:inline xmlns:a="http://schemas.openxmlformats.org/drawingml/2006/main" xmlns:pic="http://schemas.openxmlformats.org/drawingml/2006/picture">
+            <wp:extent cx="3835628" cy="4680000"/>
+            <wp:docPr id="14" name="Picture 14" descr="Forma za unos master-detail zahteva"/>
+            <wp:cNvGraphicFramePr>
+              <a:graphicFrameLocks noChangeAspect="1"/>
+            </wp:cNvGraphicFramePr>
+            <a:graphic>
+              <a:graphicData uri="http://schemas.openxmlformats.org/drawingml/2006/picture">
+                <pic:pic>
+                  <pic:nvPicPr>
+                    <pic:cNvPr id="0" name="05-master-detail-forma.png"/>
+                    <pic:cNvPicPr/>
+                  </pic:nvPicPr>
+                  <pic:blipFill>
+                    <a:blip r:embed="rId23"/>
+                    <a:stretch>
+                      <a:fillRect/>
+                    </a:stretch>
+                  </pic:blipFill>
+                  <pic:spPr>
+                    <a:xfrm>
+                      <a:off x="0" y="0"/>
+                      <a:ext cx="3835628" cy="4680000"/>
+                    </a:xfrm>
+                    <a:prstGeom prst="rect"/>
+                  </pic:spPr>
+                </pic:pic>
+              </a:graphicData>
+            </a:graphic>
+          </wp:inline>
+        </w:drawing>
+      </w:r>
+    </w:p>
+    <w:p>
+      <w:pPr>
+        <w:keepNext w:val="0"/>
+        <w:keepLines/>
+        <w:spacing w:before="40" w:after="160"/>
+        <w:jc w:val="center"/>
+      </w:pPr>
+      <w:r>
+        <w:rPr>
+          <w:rFonts w:ascii="Times New Roman" w:hAnsi="Times New Roman" w:eastAsia="Times New Roman"/>
+          <w:b w:val="0"/>
+          <w:i/>
+          <w:sz w:val="18"/>
+        </w:rPr>
+        <w:t>Slika 6. Forma za unos master-detail zahteva</w:t>
+      </w:r>
+    </w:p>
+    <w:p>
+      <w:pPr/>
+      <w:r>
+        <w:t>Neispravne ili nepotpune vrednosti ne čuvaju zahtev. Poruke uz polja objašnjavaju šta treba ispraviti; nakon korekcije korisnik ponovo bira komandu za čuvanje.</w:t>
+      </w:r>
+    </w:p>
+    <w:p>
+      <w:pPr>
+        <w:keepNext/>
+        <w:spacing w:after="20"/>
+        <w:jc w:val="center"/>
+      </w:pPr>
+      <w:r>
+        <w:drawing>
+          <wp:inline xmlns:a="http://schemas.openxmlformats.org/drawingml/2006/main" xmlns:pic="http://schemas.openxmlformats.org/drawingml/2006/picture">
+            <wp:extent cx="3386390" cy="4320000"/>
+            <wp:docPr id="20" name="Picture 20" descr="Validacije forme"/>
+            <wp:cNvGraphicFramePr>
+              <a:graphicFrameLocks noChangeAspect="1"/>
+            </wp:cNvGraphicFramePr>
+            <a:graphic>
+              <a:graphicData uri="http://schemas.openxmlformats.org/drawingml/2006/picture">
+                <pic:pic>
+                  <pic:nvPicPr>
+                    <pic:cNvPr id="0" name="06-validacije-forme.png"/>
+                    <pic:cNvPicPr/>
+                  </pic:nvPicPr>
+                  <pic:blipFill>
+                    <a:blip r:embed="rId29"/>
+                    <a:stretch>
+                      <a:fillRect/>
+                    </a:stretch>
+                  </pic:blipFill>
+                  <pic:spPr>
+                    <a:xfrm>
+                      <a:off x="0" y="0"/>
+                      <a:ext cx="3386390" cy="4320000"/>
+                    </a:xfrm>
+                    <a:prstGeom prst="rect"/>
+                  </pic:spPr>
+                </pic:pic>
+              </a:graphicData>
+            </a:graphic>
+          </wp:inline>
+        </w:drawing>
+      </w:r>
+    </w:p>
+    <w:p>
+      <w:pPr>
+        <w:keepNext w:val="0"/>
+        <w:keepLines/>
+        <w:spacing w:before="40" w:after="160"/>
+        <w:jc w:val="center"/>
+      </w:pPr>
+      <w:r>
+        <w:rPr>
+          <w:rFonts w:ascii="Times New Roman" w:hAnsi="Times New Roman" w:eastAsia="Times New Roman"/>
+          <w:b w:val="0"/>
+          <w:i/>
+          <w:sz w:val="18"/>
+        </w:rPr>
+        <w:t>Slika 7. Klijentske i serverske poruke validacije na formi</w:t>
+      </w:r>
+    </w:p>
+    <w:p>
+      <w:pPr/>
+      <w:r>
+        <w:t>Komanda Izmeni otvara postojeći zahtev sa učitanim podacima. Posle promene i potvrde, podaci se čuvaju zajedno sa povezanim detail zapisima. Izmena odobrenog zahteva vraća status na proveru kako bi poslovno pravilo ponovo bilo primenjeno.</w:t>
+      </w:r>
+    </w:p>
+    <w:p>
+      <w:pPr>
+        <w:keepNext/>
+        <w:spacing w:after="20"/>
+        <w:jc w:val="center"/>
+      </w:pPr>
+      <w:r>
+        <w:drawing>
+          <wp:inline xmlns:a="http://schemas.openxmlformats.org/drawingml/2006/main" xmlns:pic="http://schemas.openxmlformats.org/drawingml/2006/picture">
+            <wp:extent cx="3586054" cy="4500000"/>
+            <wp:docPr id="16" name="Picture 16" descr="Forma za izmenu zahteva"/>
+            <wp:cNvGraphicFramePr>
+              <a:graphicFrameLocks noChangeAspect="1"/>
+            </wp:cNvGraphicFramePr>
+            <a:graphic>
+              <a:graphicData uri="http://schemas.openxmlformats.org/drawingml/2006/picture">
+                <pic:pic>
+                  <pic:nvPicPr>
+                    <pic:cNvPr id="0" name="10-izmena-zahteva.png"/>
+                    <pic:cNvPicPr/>
+                  </pic:nvPicPr>
+                  <pic:blipFill>
+                    <a:blip r:embed="rId25"/>
+                    <a:stretch>
+                      <a:fillRect/>
+                    </a:stretch>
+                  </pic:blipFill>
+                  <pic:spPr>
+                    <a:xfrm>
+                      <a:off x="0" y="0"/>
+                      <a:ext cx="3586054" cy="4500000"/>
+                    </a:xfrm>
+                    <a:prstGeom prst="rect"/>
+                  </pic:spPr>
+                </pic:pic>
+              </a:graphicData>
+            </a:graphic>
+          </wp:inline>
+        </w:drawing>
+      </w:r>
+    </w:p>
+    <w:p>
+      <w:pPr>
+        <w:keepNext w:val="0"/>
+        <w:keepLines/>
+        <w:spacing w:before="40" w:after="160"/>
+        <w:jc w:val="center"/>
+      </w:pPr>
+      <w:r>
+        <w:rPr>
+          <w:rFonts w:ascii="Times New Roman" w:hAnsi="Times New Roman" w:eastAsia="Times New Roman"/>
+          <w:b w:val="0"/>
+          <w:i/>
+          <w:sz w:val="18"/>
+        </w:rPr>
+        <w:t>Slika 8. Forma za izmenu postojećeg zahteva</w:t>
+      </w:r>
+    </w:p>
+    <w:p>
+      <w:r>
+        <w:br w:type="page"/>
+      </w:r>
+    </w:p>
+    <w:p>
+      <w:pPr>
+        <w:pStyle w:val="Heading2"/>
+      </w:pPr>
+      <w:r>
+        <w:t>3.5. Detalji i provera poslovnog pravila</w:t>
+      </w:r>
+    </w:p>
+    <w:p>
+      <w:pPr/>
+      <w:r>
+        <w:t>Komanda Detalji prikazuje master zahtev, kandidata, sportsku disciplinu, dokumentaciju, roditelja ili staratelja kada postoji i istoriju statusa. Na istoj stranici pokreće se provera poslovnog pravila.</w:t>
+      </w:r>
+    </w:p>
+    <w:p>
+      <w:pPr>
+        <w:keepNext/>
+        <w:spacing w:after="20"/>
+        <w:jc w:val="center"/>
+      </w:pPr>
+      <w:r>
+        <w:drawing>
+          <wp:inline xmlns:a="http://schemas.openxmlformats.org/drawingml/2006/main" xmlns:pic="http://schemas.openxmlformats.org/drawingml/2006/picture">
+            <wp:extent cx="4980931" cy="4680000"/>
+            <wp:docPr id="15" name="Picture 15" descr="Detalji zahteva sa detail podacima"/>
+            <wp:cNvGraphicFramePr>
+              <a:graphicFrameLocks noChangeAspect="1"/>
+            </wp:cNvGraphicFramePr>
+            <a:graphic>
+              <a:graphicData uri="http://schemas.openxmlformats.org/drawingml/2006/picture">
+                <pic:pic>
+                  <pic:nvPicPr>
+                    <pic:cNvPr id="0" name="07-detalji-master-detail.png"/>
+                    <pic:cNvPicPr/>
+                  </pic:nvPicPr>
+                  <pic:blipFill>
+                    <a:blip r:embed="rId24"/>
+                    <a:stretch>
+                      <a:fillRect/>
+                    </a:stretch>
+                  </pic:blipFill>
+                  <pic:spPr>
+                    <a:xfrm>
+                      <a:off x="0" y="0"/>
+                      <a:ext cx="4980931" cy="4680000"/>
+                    </a:xfrm>
+                    <a:prstGeom prst="rect"/>
+                  </pic:spPr>
+                </pic:pic>
+              </a:graphicData>
+            </a:graphic>
+          </wp:inline>
+        </w:drawing>
+      </w:r>
+    </w:p>
+    <w:p>
+      <w:pPr>
+        <w:keepNext w:val="0"/>
+        <w:keepLines/>
+        <w:spacing w:before="40" w:after="160"/>
+        <w:jc w:val="center"/>
+      </w:pPr>
+      <w:r>
+        <w:rPr>
+          <w:rFonts w:ascii="Times New Roman" w:hAnsi="Times New Roman" w:eastAsia="Times New Roman"/>
+          <w:b w:val="0"/>
+          <w:i/>
+          <w:sz w:val="18"/>
+        </w:rPr>
+        <w:t>Slika 9. Pojedinačni prikaz master zahteva sa detail podacima</w:t>
+      </w:r>
+    </w:p>
+    <w:p>
+      <w:pPr/>
+      <w:r>
+        <w:t>Zahtev se odobrava samo ako sportski pregled nije stariji od X meseci, test sposobnosti je položen i odgovarajući dokazi su označeni kao dostavljeni. Ako neki uslov nije ispunjen, status ostaje neodobren i prikazuje se konkretan razlog.</w:t>
+      </w:r>
+    </w:p>
+    <w:p>
+      <w:pPr>
+        <w:keepNext/>
+        <w:spacing w:after="20"/>
+        <w:jc w:val="center"/>
+      </w:pPr>
+      <w:r>
+        <w:drawing>
+          <wp:inline xmlns:a="http://schemas.openxmlformats.org/drawingml/2006/main" xmlns:pic="http://schemas.openxmlformats.org/drawingml/2006/picture">
+            <wp:extent cx="4371609" cy="4320000"/>
+            <wp:docPr id="21" name="Picture 21" descr="Neispunjeno poslovno pravilo"/>
+            <wp:cNvGraphicFramePr>
+              <a:graphicFrameLocks noChangeAspect="1"/>
+            </wp:cNvGraphicFramePr>
+            <a:graphic>
+              <a:graphicData uri="http://schemas.openxmlformats.org/drawingml/2006/picture">
+                <pic:pic>
+                  <pic:nvPicPr>
+                    <pic:cNvPr id="0" name="08-poslovno-pravilo-odbijanje.png"/>
+                    <pic:cNvPicPr/>
+                  </pic:nvPicPr>
+                  <pic:blipFill>
+                    <a:blip r:embed="rId30"/>
+                    <a:stretch>
+                      <a:fillRect/>
+                    </a:stretch>
+                  </pic:blipFill>
+                  <pic:spPr>
+                    <a:xfrm>
+                      <a:off x="0" y="0"/>
+                      <a:ext cx="4371609" cy="4320000"/>
+                    </a:xfrm>
+                    <a:prstGeom prst="rect"/>
+                  </pic:spPr>
+                </pic:pic>
+              </a:graphicData>
+            </a:graphic>
+          </wp:inline>
+        </w:drawing>
+      </w:r>
+    </w:p>
+    <w:p>
+      <w:pPr>
+        <w:keepNext w:val="0"/>
+        <w:keepLines/>
+        <w:spacing w:before="40" w:after="160"/>
+        <w:jc w:val="center"/>
+      </w:pPr>
+      <w:r>
+        <w:rPr>
+          <w:rFonts w:ascii="Times New Roman" w:hAnsi="Times New Roman" w:eastAsia="Times New Roman"/>
+          <w:b w:val="0"/>
+          <w:i/>
+          <w:sz w:val="18"/>
+        </w:rPr>
+        <w:t>Slika 10. Neuspešna provera poslovnog pravila sa konkretnim razlogom</w:t>
+      </w:r>
+    </w:p>
+    <w:p>
+      <w:pPr/>
+      <w:r>
+        <w:t>Kada su svi uslovi ispunjeni, sistem menja status u Odobren i evidentira promenu u istoriji statusa.</w:t>
+      </w:r>
+    </w:p>
+    <w:p>
+      <w:pPr>
+        <w:keepNext/>
+        <w:spacing w:after="20"/>
+        <w:jc w:val="center"/>
+      </w:pPr>
+      <w:r>
+        <w:drawing>
+          <wp:inline xmlns:a="http://schemas.openxmlformats.org/drawingml/2006/main" xmlns:pic="http://schemas.openxmlformats.org/drawingml/2006/picture">
+            <wp:extent cx="4220352" cy="4320000"/>
+            <wp:docPr id="22" name="Picture 22" descr="Uspešno odobrenje poslovnog pravila"/>
+            <wp:cNvGraphicFramePr>
+              <a:graphicFrameLocks noChangeAspect="1"/>
+            </wp:cNvGraphicFramePr>
+            <a:graphic>
+              <a:graphicData uri="http://schemas.openxmlformats.org/drawingml/2006/picture">
+                <pic:pic>
+                  <pic:nvPicPr>
+                    <pic:cNvPr id="0" name="09-poslovno-pravilo-odobrenje.png"/>
+                    <pic:cNvPicPr/>
+                  </pic:nvPicPr>
+                  <pic:blipFill>
+                    <a:blip r:embed="rId31"/>
+                    <a:stretch>
+                      <a:fillRect/>
+                    </a:stretch>
+                  </pic:blipFill>
+                  <pic:spPr>
+                    <a:xfrm>
+                      <a:off x="0" y="0"/>
+                      <a:ext cx="4220352" cy="4320000"/>
+                    </a:xfrm>
+                    <a:prstGeom prst="rect"/>
+                  </pic:spPr>
+                </pic:pic>
+              </a:graphicData>
+            </a:graphic>
+          </wp:inline>
+        </w:drawing>
+      </w:r>
+    </w:p>
+    <w:p>
+      <w:pPr>
+        <w:keepNext w:val="0"/>
+        <w:keepLines/>
+        <w:spacing w:before="40" w:after="160"/>
+        <w:jc w:val="center"/>
+      </w:pPr>
+      <w:r>
+        <w:rPr>
+          <w:rFonts w:ascii="Times New Roman" w:hAnsi="Times New Roman" w:eastAsia="Times New Roman"/>
+          <w:b w:val="0"/>
+          <w:i/>
+          <w:sz w:val="18"/>
+        </w:rPr>
+        <w:t>Slika 11. Uspešna provera poslovnog pravila i status Odobren</w:t>
+      </w:r>
+    </w:p>
+    <w:p>
+      <w:r>
+        <w:br w:type="page"/>
+      </w:r>
+    </w:p>
+    <w:p>
+      <w:pPr>
+        <w:pStyle w:val="Heading2"/>
+      </w:pPr>
+      <w:r>
+        <w:t>3.6. Brisanje zahteva</w:t>
+      </w:r>
+    </w:p>
+    <w:p>
+      <w:pPr/>
+      <w:r>
+        <w:t>Brisanje je dostupno samo administratoru. Pre konačnog uklanjanja prikazuje se stranica za potvrdu; izborom Odustani zapis ostaje nepromenjen.</w:t>
+      </w:r>
+    </w:p>
+    <w:p>
+      <w:pPr>
+        <w:keepNext/>
+        <w:spacing w:after="20"/>
+        <w:jc w:val="center"/>
+      </w:pPr>
+      <w:r>
+        <w:drawing>
+          <wp:inline xmlns:a="http://schemas.openxmlformats.org/drawingml/2006/main" xmlns:pic="http://schemas.openxmlformats.org/drawingml/2006/picture">
+            <wp:extent cx="5332114" cy="3888000"/>
+            <wp:docPr id="17" name="Picture 17" descr="Administratorska potvrda brisanja"/>
+            <wp:cNvGraphicFramePr>
+              <a:graphicFrameLocks noChangeAspect="1"/>
+            </wp:cNvGraphicFramePr>
+            <a:graphic>
+              <a:graphicData uri="http://schemas.openxmlformats.org/drawingml/2006/picture">
+                <pic:pic>
+                  <pic:nvPicPr>
+                    <pic:cNvPr id="0" name="16-administrator-brisanje.png"/>
+                    <pic:cNvPicPr/>
+                  </pic:nvPicPr>
+                  <pic:blipFill>
+                    <a:blip r:embed="rId26"/>
+                    <a:stretch>
+                      <a:fillRect/>
+                    </a:stretch>
+                  </pic:blipFill>
+                  <pic:spPr>
+                    <a:xfrm>
+                      <a:off x="0" y="0"/>
+                      <a:ext cx="5332114" cy="3888000"/>
+                    </a:xfrm>
+                    <a:prstGeom prst="rect"/>
+                  </pic:spPr>
+                </pic:pic>
+              </a:graphicData>
+            </a:graphic>
+          </wp:inline>
+        </w:drawing>
+      </w:r>
+    </w:p>
+    <w:p>
+      <w:pPr>
+        <w:keepNext w:val="0"/>
+        <w:keepLines/>
+        <w:spacing w:before="40" w:after="160"/>
+        <w:jc w:val="center"/>
+      </w:pPr>
+      <w:r>
+        <w:rPr>
+          <w:rFonts w:ascii="Times New Roman" w:hAnsi="Times New Roman" w:eastAsia="Times New Roman"/>
+          <w:b w:val="0"/>
+          <w:i/>
+          <w:sz w:val="18"/>
+        </w:rPr>
+        <w:t>Slika 12. Administratorska potvrda brisanja zahteva</w:t>
+      </w:r>
+    </w:p>
+    <w:p>
+      <w:pPr>
+        <w:pStyle w:val="Heading2"/>
+        <w:pageBreakBefore/>
+      </w:pPr>
+      <w:r>
+        <w:t>3.7. Štampa zahteva</w:t>
+      </w:r>
+    </w:p>
+    <w:p>
+      <w:pPr/>
+      <w:r>
+        <w:t>Aplikacija podržava tri režima štampe: jedan konkretan zahtev, sve zahteve i trenutno filtrirane zahteve. Pojedinačna štampa poslovnog dokumenta prikazana je na Slici 1.</w:t>
+      </w:r>
+    </w:p>
+    <w:p>
+      <w:pPr>
+        <w:keepNext/>
+        <w:spacing w:after="20"/>
+        <w:jc w:val="center"/>
+      </w:pPr>
+      <w:r>
+        <w:drawing>
+          <wp:inline xmlns:a="http://schemas.openxmlformats.org/drawingml/2006/main" xmlns:pic="http://schemas.openxmlformats.org/drawingml/2006/picture">
+            <wp:extent cx="5472000" cy="1417538"/>
+            <wp:docPr id="18" name="Picture 18" descr="Štampa svih zahteva"/>
+            <wp:cNvGraphicFramePr>
+              <a:graphicFrameLocks noChangeAspect="1"/>
+            </wp:cNvGraphicFramePr>
+            <a:graphic>
+              <a:graphicData uri="http://schemas.openxmlformats.org/drawingml/2006/picture">
+                <pic:pic>
+                  <pic:nvPicPr>
+                    <pic:cNvPr id="0" name="13-stampa-svih.png"/>
+                    <pic:cNvPicPr/>
+                  </pic:nvPicPr>
+                  <pic:blipFill>
+                    <a:blip r:embed="rId27"/>
+                    <a:stretch>
+                      <a:fillRect/>
+                    </a:stretch>
+                  </pic:blipFill>
+                  <pic:spPr>
+                    <a:xfrm>
+                      <a:off x="0" y="0"/>
+                      <a:ext cx="5472000" cy="1417538"/>
+                    </a:xfrm>
+                    <a:prstGeom prst="rect"/>
+                  </pic:spPr>
+                </pic:pic>
+              </a:graphicData>
+            </a:graphic>
+          </wp:inline>
+        </w:drawing>
+      </w:r>
+    </w:p>
+    <w:p>
+      <w:pPr>
+        <w:keepNext w:val="0"/>
+        <w:keepLines/>
+        <w:spacing w:before="40" w:after="160"/>
+        <w:jc w:val="center"/>
+      </w:pPr>
+      <w:r>
+        <w:rPr>
+          <w:rFonts w:ascii="Times New Roman" w:hAnsi="Times New Roman" w:eastAsia="Times New Roman"/>
+          <w:b w:val="0"/>
+          <w:i/>
+          <w:sz w:val="18"/>
+        </w:rPr>
+        <w:t>Slika 13. Printer-friendly štampa svih zahteva</w:t>
+      </w:r>
+    </w:p>
+    <w:p>
+      <w:pPr>
+        <w:keepNext/>
+        <w:spacing w:after="20"/>
+        <w:jc w:val="center"/>
+      </w:pPr>
+      <w:r>
+        <w:drawing>
+          <wp:inline xmlns:a="http://schemas.openxmlformats.org/drawingml/2006/main" xmlns:pic="http://schemas.openxmlformats.org/drawingml/2006/picture">
+            <wp:extent cx="5472000" cy="967889"/>
+            <wp:docPr id="19" name="Picture 19" descr="Filtrirana štampa zahteva"/>
+            <wp:cNvGraphicFramePr>
+              <a:graphicFrameLocks noChangeAspect="1"/>
+            </wp:cNvGraphicFramePr>
+            <a:graphic>
+              <a:graphicData uri="http://schemas.openxmlformats.org/drawingml/2006/picture">
+                <pic:pic>
+                  <pic:nvPicPr>
+                    <pic:cNvPr id="0" name="14-stampa-filtriranih.png"/>
+                    <pic:cNvPicPr/>
+                  </pic:nvPicPr>
+                  <pic:blipFill>
+                    <a:blip r:embed="rId28"/>
+                    <a:stretch>
+                      <a:fillRect/>
+                    </a:stretch>
+                  </pic:blipFill>
+                  <pic:spPr>
+                    <a:xfrm>
+                      <a:off x="0" y="0"/>
+                      <a:ext cx="5472000" cy="967889"/>
+                    </a:xfrm>
+                    <a:prstGeom prst="rect"/>
+                  </pic:spPr>
+                </pic:pic>
+              </a:graphicData>
+            </a:graphic>
+          </wp:inline>
+        </w:drawing>
+      </w:r>
+    </w:p>
+    <w:p>
+      <w:pPr>
+        <w:keepNext w:val="0"/>
+        <w:keepLines/>
+        <w:spacing w:before="40" w:after="160"/>
+        <w:jc w:val="center"/>
+      </w:pPr>
+      <w:r>
+        <w:rPr>
+          <w:rFonts w:ascii="Times New Roman" w:hAnsi="Times New Roman" w:eastAsia="Times New Roman"/>
+          <w:b w:val="0"/>
+          <w:i/>
+          <w:sz w:val="18"/>
+        </w:rPr>
+        <w:t>Slika 14. Printer-friendly štampa filtriranih zahteva</w:t>
+      </w:r>
+    </w:p>
+    <w:p>
+      <w:r>
+        <w:br w:type="page"/>
+      </w:r>
+    </w:p>
+    <w:p>
+      <w:pPr>
+        <w:pStyle w:val="Heading2"/>
+      </w:pPr>
+      <w:r>
+        <w:t>3.8. Pregled REST servisa</w:t>
+      </w:r>
+    </w:p>
+    <w:p>
+      <w:pPr/>
+      <w:r>
+        <w:t>Stavka REST servis u meniju otvara pregled dostupnih resursa i trenutnih parametara poslovnog pravila. Sirovi JSON odgovor ostaje dostupan za mašinsko korišćenje. Endpoint /api/zahtevi/{id} vraća jedan zahtev prema prosleđenom identifikatoru.</w:t>
+      </w:r>
+    </w:p>
+    <w:p>
+      <w:pPr>
+        <w:keepNext/>
+        <w:spacing w:after="20"/>
+        <w:jc w:val="center"/>
+      </w:pPr>
+      <w:r>
+        <w:drawing>
+          <wp:inline xmlns:a="http://schemas.openxmlformats.org/drawingml/2006/main" xmlns:pic="http://schemas.openxmlformats.org/drawingml/2006/picture">
+            <wp:extent cx="5400000" cy="761250"/>
+            <wp:docPr id="23" name="Picture 23" descr="REST JSON odgovor"/>
+            <wp:cNvGraphicFramePr>
+              <a:graphicFrameLocks noChangeAspect="1"/>
+            </wp:cNvGraphicFramePr>
+            <a:graphic>
+              <a:graphicData uri="http://schemas.openxmlformats.org/drawingml/2006/picture">
+                <pic:pic>
+                  <pic:nvPicPr>
+                    <pic:cNvPr id="0" name="15-rest-json.png"/>
+                    <pic:cNvPicPr/>
+                  </pic:nvPicPr>
+                  <pic:blipFill>
+                    <a:blip r:embed="rId32"/>
+                    <a:stretch>
+                      <a:fillRect/>
+                    </a:stretch>
+                  </pic:blipFill>
+                  <pic:spPr>
+                    <a:xfrm>
+                      <a:off x="0" y="0"/>
+                      <a:ext cx="5400000" cy="761250"/>
+                    </a:xfrm>
+                    <a:prstGeom prst="rect"/>
+                  </pic:spPr>
+                </pic:pic>
+              </a:graphicData>
+            </a:graphic>
+          </wp:inline>
+        </w:drawing>
+      </w:r>
+    </w:p>
+    <w:p>
+      <w:pPr>
+        <w:keepNext w:val="0"/>
+        <w:keepLines/>
+        <w:spacing w:before="40" w:after="160"/>
+        <w:jc w:val="center"/>
+      </w:pPr>
+      <w:r>
+        <w:rPr>
+          <w:rFonts w:ascii="Times New Roman" w:hAnsi="Times New Roman" w:eastAsia="Times New Roman"/>
+          <w:b w:val="0"/>
+          <w:i/>
+          <w:sz w:val="18"/>
+        </w:rPr>
+        <w:t>Slika 15. REST odgovor za konkretan zahtev u JSON formatu</w:t>
+      </w:r>
+    </w:p>
+    <w:p>
+      <w:pPr>
+        <w:pStyle w:val="Heading1"/>
+        <w:keepNext/>
+        <w:pageBreakBefore/>
         <w:spacing w:before="160" w:after="100"/>
       </w:pPr>
       <w:r>
@@ -6294,7 +7408,7 @@
           <w:color w:val="365F91"/>
           <w:sz w:val="28"/>
         </w:rPr>
-        <w:t>3. Kratak opis primenjenih alata</w:t>
+        <w:t>4. Kratak opis primenjenih alata</w:t>
       </w:r>
     </w:p>
     <w:p>
@@ -6372,7 +7486,7 @@
           <w:rFonts w:ascii="Times New Roman" w:hAnsi="Times New Roman" w:eastAsia="Times New Roman"/>
           <w:sz w:val="23"/>
         </w:rPr>
-        <w:t>Korisnički interfejs je izrađen Razor/HTML prikazima, CSS-om, Bootstrap 3.4.1 bibliotekom i jQuery 3.4.1. Klijentska validacija uključuje jQuery Validation 1.17.0 i Microsoft jQuery Unobtrusive Validation 3.2.11, dok se Data Annotation pravila iz ViewModel klase prenose do klijentske validacije. Za verzionisanje izvornog koda koristi se Git i GitHub; završna funkcionalna provera izvršena je na izolovanoj draft test grani, bez izmene produkcionog koda na glavnoj grani. Dijagrami u ovoj dokumentaciji generisani su programski na osnovu stvarnih klasa i SQL šeme, kako bi nazivi i veze ostali usklađeni sa implementacijom.</w:t>
+        <w:t>Korisnički interfejs je izrađen Razor/HTML prikazima, CSS-om, Bootstrap 3.4.1 bibliotekom i jQuery 3.4.1. Klijentska validacija uključuje jQuery Validation 1.17.0 i Microsoft jQuery Unobtrusive Validation 3.2.11, dok se Data Annotation pravila iz ViewModel klase prenose do klijentske validacije. Za verzionisanje izvornog koda koriste se Git i GitHub; završna funkcionalna provera izvršena je na izolovanoj testnoj grani, a proverene korekcije su zatim uključene u glavnu granu main. Dijagrami u ovoj dokumentaciji generisani su programski na osnovu stvarnih klasa i SQL šeme, kako bi nazivi i veze ostali usklađeni sa implementacijom.</w:t>
       </w:r>
     </w:p>
     <w:p>
@@ -6384,6 +7498,7 @@
       <w:pPr>
         <w:pStyle w:val="Heading1"/>
         <w:keepNext/>
+        <w:pageBreakBefore/>
         <w:spacing w:before="160" w:after="100"/>
       </w:pPr>
       <w:r>
@@ -6393,7 +7508,7 @@
           <w:color w:val="365F91"/>
           <w:sz w:val="28"/>
         </w:rPr>
-        <w:t>4. Modeli dokumentovanja realizovanog rešenja</w:t>
+        <w:t>5. Modeli dokumentovanja realizovanog rešenja</w:t>
       </w:r>
     </w:p>
     <w:p>
@@ -6409,7 +7524,7 @@
           <w:color w:val="4F81BD"/>
           <w:sz w:val="26"/>
         </w:rPr>
-        <w:t>4.1. Dijagram slučajeva korišćenja</w:t>
+        <w:t>5.1. Dijagram slučajeva korišćenja</w:t>
       </w:r>
     </w:p>
     <w:p>
@@ -6466,7 +7581,7 @@
           <w:i/>
           <w:sz w:val="21"/>
         </w:rPr>
-        <w:t>Slika 2. Dijagram slučajeva korišćenja sistema za učlanjivanje u sportski klub</w:t>
+        <w:t>Slika 16. Dijagram slučajeva korišćenja sistema za učlanjivanje u sportski klub</w:t>
       </w:r>
     </w:p>
     <w:p>
@@ -6500,7 +7615,7 @@
           <w:color w:val="4F81BD"/>
           <w:sz w:val="26"/>
         </w:rPr>
-        <w:t>4.2. Relacioni model podataka</w:t>
+        <w:t>5.2. Relacioni model podataka</w:t>
       </w:r>
     </w:p>
     <w:p>
@@ -6557,7 +7672,7 @@
           <w:i/>
           <w:sz w:val="21"/>
         </w:rPr>
-        <w:t>Slika 3. Relacioni model baze RVS2026SportskiKlub</w:t>
+        <w:t>Slika 17. Relacioni model baze RVS2026SportskiKlub</w:t>
       </w:r>
     </w:p>
     <w:p>
@@ -6591,7 +7706,7 @@
           <w:color w:val="4F81BD"/>
           <w:sz w:val="26"/>
         </w:rPr>
-        <w:t>4.3. Dijagram komponenti</w:t>
+        <w:t>5.3. Dijagram komponenti</w:t>
       </w:r>
     </w:p>
     <w:p>
@@ -6648,7 +7763,7 @@
           <w:i/>
           <w:sz w:val="21"/>
         </w:rPr>
-        <w:t>Slika 4. Dijagram komponenti višeslojnog rešenja</w:t>
+        <w:t>Slika 18. Dijagram komponenti višeslojnog rešenja</w:t>
       </w:r>
     </w:p>
     <w:p>
@@ -6682,7 +7797,7 @@
           <w:color w:val="4F81BD"/>
           <w:sz w:val="26"/>
         </w:rPr>
-        <w:t>4.4. Dijagram klasa</w:t>
+        <w:t>5.4. Dijagram klasa</w:t>
       </w:r>
     </w:p>
     <w:p>
@@ -6739,7 +7854,7 @@
           <w:i/>
           <w:sz w:val="21"/>
         </w:rPr>
-        <w:t>Slika 5. Dijagram relevantnih klasa sloja podataka i poslovne logike</w:t>
+        <w:t>Slika 19. Dijagram relevantnih klasa sloja podataka i poslovne logike</w:t>
       </w:r>
     </w:p>
     <w:p>
@@ -6773,7 +7888,7 @@
           <w:color w:val="4F81BD"/>
           <w:sz w:val="26"/>
         </w:rPr>
-        <w:t>4.5. Dijagrami sekvenci</w:t>
+        <w:t>5.5. Dijagrami sekvenci</w:t>
       </w:r>
     </w:p>
     <w:p>
@@ -6789,7 +7904,7 @@
           <w:color w:val="4F81BD"/>
           <w:sz w:val="24"/>
         </w:rPr>
-        <w:t>4.5.1. Dijagram sekvenci za unos zahteva</w:t>
+        <w:t>5.5.1. Dijagram sekvenci za unos zahteva</w:t>
       </w:r>
     </w:p>
     <w:p>
@@ -6846,7 +7961,7 @@
           <w:i/>
           <w:sz w:val="21"/>
         </w:rPr>
-        <w:t>Slika 6. Dijagram sekvenci za unos master-detail zahteva i proveru poslovnog pravila</w:t>
+        <w:t>Slika 20. Dijagram sekvenci za unos master-detail zahteva i proveru poslovnog pravila</w:t>
       </w:r>
     </w:p>
     <w:p>
@@ -6880,7 +7995,7 @@
           <w:color w:val="4F81BD"/>
           <w:sz w:val="24"/>
         </w:rPr>
-        <w:t>4.5.2. Dijagram sekvenci za tabelarni prikaz i filtriranje zahteva</w:t>
+        <w:t>5.5.2. Dijagram sekvenci za tabelarni prikaz i filtriranje zahteva</w:t>
       </w:r>
     </w:p>
     <w:p>
@@ -6937,7 +8052,7 @@
           <w:i/>
           <w:sz w:val="21"/>
         </w:rPr>
-        <w:t>Slika 7. Dijagram sekvenci za tabelarni prikaz, filtriranje i filtriranu štampu</w:t>
+        <w:t>Slika 21. Dijagram sekvenci za tabelarni prikaz, filtriranje i filtriranu štampu</w:t>
       </w:r>
     </w:p>
     <w:p>
@@ -6962,6 +8077,7 @@
       <w:pPr>
         <w:pStyle w:val="Heading1"/>
         <w:keepNext/>
+        <w:pageBreakBefore/>
         <w:spacing w:before="160" w:after="100"/>
       </w:pPr>
       <w:r>
@@ -6971,7 +8087,7 @@
           <w:color w:val="365F91"/>
           <w:sz w:val="28"/>
         </w:rPr>
-        <w:t>5. Ključni delovi koda sa objašnjenjem</w:t>
+        <w:t>6. Ključni delovi koda sa objašnjenjem</w:t>
       </w:r>
     </w:p>
     <w:p>
@@ -6984,7 +8100,7 @@
           <w:rFonts w:ascii="Times New Roman" w:hAnsi="Times New Roman" w:eastAsia="Times New Roman"/>
           <w:sz w:val="23"/>
         </w:rPr>
-        <w:t>U nastavku su prikazani isečci stvarnog izvornog koda iz finalne verzije projekta. Listing prikazuje samo linije potrebne da se dokaže konkretan zahtev; identifikatori i logika nisu preimenovani niti zamenjeni pseudokodom. Svaki listing je povezan sa slojem, ulazom/izlazom, profesorovim zahtevom i relevantnom validacijom ili transakcijom.</w:t>
+        <w:t>U nastavku su prikazani isečci stvarnog izvornog koda iz finalne verzije projekta. Korisničko uputstvo izdvojeno je u poglavlju 3, dok ovo poglavlje predstavlja tehnički dokaz realizacije. Listing prikazuje samo linije potrebne da se dokaže konkretan zahtev; identifikatori i logika nisu preimenovani niti zamenjeni pseudokodom. Svaki listing je praćen objašnjenjem ulaza, obrade i izlaza.</w:t>
       </w:r>
     </w:p>
     <w:p>
@@ -7000,7 +8116,7 @@
           <w:color w:val="4F81BD"/>
           <w:sz w:val="26"/>
         </w:rPr>
-        <w:t>5.1. Realizacija korisničkih softverskih funkcija</w:t>
+        <w:t>6.1. Realizacija korisničkih softverskih funkcija</w:t>
       </w:r>
     </w:p>
     <w:p>
@@ -7016,130 +8132,7 @@
           <w:color w:val="4F81BD"/>
           <w:sz w:val="24"/>
         </w:rPr>
-        <w:t>5.1.1. Prijava korisnika</w:t>
-      </w:r>
-    </w:p>
-    <w:p>
-      <w:pPr>
-        <w:keepNext/>
-        <w:spacing w:after="20"/>
-        <w:jc w:val="center"/>
-      </w:pPr>
-      <w:r>
-        <w:drawing>
-          <wp:inline xmlns:a="http://schemas.openxmlformats.org/drawingml/2006/main" xmlns:pic="http://schemas.openxmlformats.org/drawingml/2006/picture">
-            <wp:extent cx="5472000" cy="4009000"/>
-            <wp:docPr id="10" name="Picture 10" descr="Stranica za prijavu korisnika"/>
-            <wp:cNvGraphicFramePr>
-              <a:graphicFrameLocks noChangeAspect="1"/>
-            </wp:cNvGraphicFramePr>
-            <a:graphic>
-              <a:graphicData uri="http://schemas.openxmlformats.org/drawingml/2006/picture">
-                <pic:pic>
-                  <pic:nvPicPr>
-                    <pic:cNvPr id="0" name="01-prijava.png"/>
-                    <pic:cNvPicPr/>
-                  </pic:nvPicPr>
-                  <pic:blipFill>
-                    <a:blip r:embed="rId19"/>
-                    <a:stretch>
-                      <a:fillRect/>
-                    </a:stretch>
-                  </pic:blipFill>
-                  <pic:spPr>
-                    <a:xfrm>
-                      <a:off x="0" y="0"/>
-                      <a:ext cx="5472000" cy="4009000"/>
-                    </a:xfrm>
-                    <a:prstGeom prst="rect"/>
-                  </pic:spPr>
-                </pic:pic>
-              </a:graphicData>
-            </a:graphic>
-          </wp:inline>
-        </w:drawing>
-      </w:r>
-    </w:p>
-    <w:p>
-      <w:pPr>
-        <w:keepNext w:val="0"/>
-        <w:spacing w:before="60" w:after="100"/>
-        <w:jc w:val="center"/>
-      </w:pPr>
-      <w:r>
-        <w:rPr>
-          <w:rFonts w:ascii="Times New Roman" w:hAnsi="Times New Roman" w:eastAsia="Times New Roman"/>
-          <w:b w:val="0"/>
-          <w:i/>
-          <w:sz w:val="21"/>
-        </w:rPr>
-        <w:t>Slika 8. Stranica za prijavu ovlašćenog korisnika</w:t>
-      </w:r>
-    </w:p>
-    <w:p>
-      <w:pPr>
-        <w:spacing w:after="100" w:line="259" w:lineRule="auto"/>
-        <w:ind w:firstLine="397"/>
-      </w:pPr>
-      <w:r>
-        <w:t>Prijava je ulazna funkcija sistema. Korisnik unosi korisničko ime i šifru, a nakon uspešne provere aplikacija formira sesiju i preusmerava na početnu stranicu. Neuspešna prijava ne formira sesiju i prikazuje kontrolisanu poruku, što je prikazano na Slici 9.</w:t>
-      </w:r>
-    </w:p>
-    <w:p>
-      <w:pPr>
-        <w:keepNext/>
-        <w:spacing w:after="20"/>
-        <w:jc w:val="center"/>
-      </w:pPr>
-      <w:r>
-        <w:drawing>
-          <wp:inline xmlns:a="http://schemas.openxmlformats.org/drawingml/2006/main" xmlns:pic="http://schemas.openxmlformats.org/drawingml/2006/picture">
-            <wp:extent cx="5159431" cy="3780000"/>
-            <wp:docPr id="11" name="Picture 11" descr="Neuspešna prijava korisnika"/>
-            <wp:cNvGraphicFramePr>
-              <a:graphicFrameLocks noChangeAspect="1"/>
-            </wp:cNvGraphicFramePr>
-            <a:graphic>
-              <a:graphicData uri="http://schemas.openxmlformats.org/drawingml/2006/picture">
-                <pic:pic>
-                  <pic:nvPicPr>
-                    <pic:cNvPr id="0" name="02-pogresna-prijava.png"/>
-                    <pic:cNvPicPr/>
-                  </pic:nvPicPr>
-                  <pic:blipFill>
-                    <a:blip r:embed="rId20"/>
-                    <a:stretch>
-                      <a:fillRect/>
-                    </a:stretch>
-                  </pic:blipFill>
-                  <pic:spPr>
-                    <a:xfrm>
-                      <a:off x="0" y="0"/>
-                      <a:ext cx="5159431" cy="3780000"/>
-                    </a:xfrm>
-                    <a:prstGeom prst="rect"/>
-                  </pic:spPr>
-                </pic:pic>
-              </a:graphicData>
-            </a:graphic>
-          </wp:inline>
-        </w:drawing>
-      </w:r>
-    </w:p>
-    <w:p>
-      <w:pPr>
-        <w:keepNext w:val="0"/>
-        <w:spacing w:before="60" w:after="100"/>
-        <w:jc w:val="center"/>
-      </w:pPr>
-      <w:r>
-        <w:rPr>
-          <w:rFonts w:ascii="Times New Roman" w:hAnsi="Times New Roman" w:eastAsia="Times New Roman"/>
-          <w:b w:val="0"/>
-          <w:i/>
-          <w:sz w:val="21"/>
-        </w:rPr>
-        <w:t>Slika 9. Kontrolisana validacija neuspešne prijave</w:t>
+        <w:t>6.1.1. Prijava korisnika</w:t>
       </w:r>
     </w:p>
     <w:p>
@@ -7403,200 +8396,7 @@
           <w:color w:val="4F81BD"/>
           <w:sz w:val="24"/>
         </w:rPr>
-        <w:t>5.1.2. CRUD operacije nad glavnom tabelom</w:t>
-      </w:r>
-    </w:p>
-    <w:p>
-      <w:pPr>
-        <w:keepNext/>
-        <w:spacing w:after="20"/>
-        <w:jc w:val="center"/>
-      </w:pPr>
-      <w:r>
-        <w:drawing>
-          <wp:inline xmlns:a="http://schemas.openxmlformats.org/drawingml/2006/main" xmlns:pic="http://schemas.openxmlformats.org/drawingml/2006/picture">
-            <wp:extent cx="4937142" cy="3600000"/>
-            <wp:docPr id="12" name="Picture 12" descr="Spisak zahteva"/>
-            <wp:cNvGraphicFramePr>
-              <a:graphicFrameLocks noChangeAspect="1"/>
-            </wp:cNvGraphicFramePr>
-            <a:graphic>
-              <a:graphicData uri="http://schemas.openxmlformats.org/drawingml/2006/picture">
-                <pic:pic>
-                  <pic:nvPicPr>
-                    <pic:cNvPr id="0" name="03-spisak-zahteva.png"/>
-                    <pic:cNvPicPr/>
-                  </pic:nvPicPr>
-                  <pic:blipFill>
-                    <a:blip r:embed="rId21"/>
-                    <a:stretch>
-                      <a:fillRect/>
-                    </a:stretch>
-                  </pic:blipFill>
-                  <pic:spPr>
-                    <a:xfrm>
-                      <a:off x="0" y="0"/>
-                      <a:ext cx="4937142" cy="3600000"/>
-                    </a:xfrm>
-                    <a:prstGeom prst="rect"/>
-                  </pic:spPr>
-                </pic:pic>
-              </a:graphicData>
-            </a:graphic>
-          </wp:inline>
-        </w:drawing>
-      </w:r>
-    </w:p>
-    <w:p>
-      <w:pPr>
-        <w:keepNext w:val="0"/>
-        <w:spacing w:before="60" w:after="100"/>
-        <w:jc w:val="center"/>
-      </w:pPr>
-      <w:r>
-        <w:rPr>
-          <w:rFonts w:ascii="Times New Roman" w:hAnsi="Times New Roman" w:eastAsia="Times New Roman"/>
-          <w:b w:val="0"/>
-          <w:i/>
-          <w:sz w:val="21"/>
-        </w:rPr>
-        <w:t>Slika 10. Tabelarni prikaz zahteva za učlanjivanje</w:t>
-      </w:r>
-    </w:p>
-    <w:p>
-      <w:pPr>
-        <w:spacing w:after="100" w:line="259" w:lineRule="auto"/>
-        <w:ind w:firstLine="397"/>
-      </w:pPr>
-      <w:r>
-        <w:t>Spisak predstavlja centralnu radnu stranicu za master tabelu. Vidljive su akcije za detalje, izmenu i pojedinačnu štampu, a referent nema komandu za brisanje. Iznad tabele su pretraga, novi zahtev i štampa svih/filtriranih zahteva. Primer filtriranja prikazan je na Slici 11.</w:t>
-      </w:r>
-    </w:p>
-    <w:p>
-      <w:pPr>
-        <w:keepNext/>
-        <w:spacing w:after="20"/>
-        <w:jc w:val="center"/>
-      </w:pPr>
-      <w:r>
-        <w:drawing>
-          <wp:inline xmlns:a="http://schemas.openxmlformats.org/drawingml/2006/main" xmlns:pic="http://schemas.openxmlformats.org/drawingml/2006/picture">
-            <wp:extent cx="4937142" cy="3600000"/>
-            <wp:docPr id="13" name="Picture 13" descr="Filtriran spisak zahteva"/>
-            <wp:cNvGraphicFramePr>
-              <a:graphicFrameLocks noChangeAspect="1"/>
-            </wp:cNvGraphicFramePr>
-            <a:graphic>
-              <a:graphicData uri="http://schemas.openxmlformats.org/drawingml/2006/picture">
-                <pic:pic>
-                  <pic:nvPicPr>
-                    <pic:cNvPr id="0" name="04-filtriranje-zahteva.png"/>
-                    <pic:cNvPicPr/>
-                  </pic:nvPicPr>
-                  <pic:blipFill>
-                    <a:blip r:embed="rId22"/>
-                    <a:stretch>
-                      <a:fillRect/>
-                    </a:stretch>
-                  </pic:blipFill>
-                  <pic:spPr>
-                    <a:xfrm>
-                      <a:off x="0" y="0"/>
-                      <a:ext cx="4937142" cy="3600000"/>
-                    </a:xfrm>
-                    <a:prstGeom prst="rect"/>
-                  </pic:spPr>
-                </pic:pic>
-              </a:graphicData>
-            </a:graphic>
-          </wp:inline>
-        </w:drawing>
-      </w:r>
-    </w:p>
-    <w:p>
-      <w:pPr>
-        <w:keepNext w:val="0"/>
-        <w:spacing w:before="60" w:after="100"/>
-        <w:jc w:val="center"/>
-      </w:pPr>
-      <w:r>
-        <w:rPr>
-          <w:rFonts w:ascii="Times New Roman" w:hAnsi="Times New Roman" w:eastAsia="Times New Roman"/>
-          <w:b w:val="0"/>
-          <w:i/>
-          <w:sz w:val="21"/>
-        </w:rPr>
-        <w:t>Slika 11. Rezultat filtriranja spiska zahteva</w:t>
-      </w:r>
-    </w:p>
-    <w:p>
-      <w:pPr>
-        <w:keepNext/>
-        <w:spacing w:after="20"/>
-        <w:jc w:val="center"/>
-      </w:pPr>
-      <w:r>
-        <w:drawing>
-          <wp:inline xmlns:a="http://schemas.openxmlformats.org/drawingml/2006/main" xmlns:pic="http://schemas.openxmlformats.org/drawingml/2006/picture">
-            <wp:extent cx="3835628" cy="4680000"/>
-            <wp:docPr id="14" name="Picture 14" descr="Forma za unos master-detail zahteva"/>
-            <wp:cNvGraphicFramePr>
-              <a:graphicFrameLocks noChangeAspect="1"/>
-            </wp:cNvGraphicFramePr>
-            <a:graphic>
-              <a:graphicData uri="http://schemas.openxmlformats.org/drawingml/2006/picture">
-                <pic:pic>
-                  <pic:nvPicPr>
-                    <pic:cNvPr id="0" name="05-master-detail-forma.png"/>
-                    <pic:cNvPicPr/>
-                  </pic:nvPicPr>
-                  <pic:blipFill>
-                    <a:blip r:embed="rId23"/>
-                    <a:stretch>
-                      <a:fillRect/>
-                    </a:stretch>
-                  </pic:blipFill>
-                  <pic:spPr>
-                    <a:xfrm>
-                      <a:off x="0" y="0"/>
-                      <a:ext cx="3835628" cy="4680000"/>
-                    </a:xfrm>
-                    <a:prstGeom prst="rect"/>
-                  </pic:spPr>
-                </pic:pic>
-              </a:graphicData>
-            </a:graphic>
-          </wp:inline>
-        </w:drawing>
-      </w:r>
-    </w:p>
-    <w:p>
-      <w:pPr>
-        <w:keepNext w:val="0"/>
-        <w:spacing w:before="60" w:after="100"/>
-        <w:jc w:val="center"/>
-      </w:pPr>
-      <w:r>
-        <w:rPr>
-          <w:rFonts w:ascii="Times New Roman" w:hAnsi="Times New Roman" w:eastAsia="Times New Roman"/>
-          <w:b w:val="0"/>
-          <w:i/>
-          <w:sz w:val="21"/>
-        </w:rPr>
-        <w:t>Slika 12. Forma za unos master-detail zahteva</w:t>
-      </w:r>
-    </w:p>
-    <w:p>
-      <w:pPr>
-        <w:spacing w:after="100" w:line="259" w:lineRule="auto"/>
-        <w:ind w:firstLine="397"/>
-      </w:pPr>
-      <w:r>
-        <w:rPr>
-          <w:rFonts w:ascii="Times New Roman" w:hAnsi="Times New Roman" w:eastAsia="Times New Roman"/>
-          <w:sz w:val="23"/>
-        </w:rPr>
-        <w:t>Forma objedinjuje podatke kandidata, master podatke zahteva, izbor discipline, statusne podatke i detail dokumentaciju. Kod čuvanja iz nje nastaju Kandidat, ZahtevZaUclanjenje, kolekcija Dokumentacija i, po potrebi, RoditeljStaratelj. Svi delovi prosleđuju se jednoj transakcionoj metodi repozitorijuma.</w:t>
+        <w:t>6.1.2. CRUD operacije nad glavnom tabelom</w:t>
       </w:r>
     </w:p>
     <w:p>
@@ -7782,133 +8582,6 @@
     <w:p>
       <w:pPr>
         <w:keepNext/>
-        <w:spacing w:after="20"/>
-        <w:jc w:val="center"/>
-      </w:pPr>
-      <w:r>
-        <w:drawing>
-          <wp:inline xmlns:a="http://schemas.openxmlformats.org/drawingml/2006/main" xmlns:pic="http://schemas.openxmlformats.org/drawingml/2006/picture">
-            <wp:extent cx="4980931" cy="4680000"/>
-            <wp:docPr id="15" name="Picture 15" descr="Detalji zahteva sa detail podacima"/>
-            <wp:cNvGraphicFramePr>
-              <a:graphicFrameLocks noChangeAspect="1"/>
-            </wp:cNvGraphicFramePr>
-            <a:graphic>
-              <a:graphicData uri="http://schemas.openxmlformats.org/drawingml/2006/picture">
-                <pic:pic>
-                  <pic:nvPicPr>
-                    <pic:cNvPr id="0" name="07-detalji-master-detail.png"/>
-                    <pic:cNvPicPr/>
-                  </pic:nvPicPr>
-                  <pic:blipFill>
-                    <a:blip r:embed="rId24"/>
-                    <a:stretch>
-                      <a:fillRect/>
-                    </a:stretch>
-                  </pic:blipFill>
-                  <pic:spPr>
-                    <a:xfrm>
-                      <a:off x="0" y="0"/>
-                      <a:ext cx="4980931" cy="4680000"/>
-                    </a:xfrm>
-                    <a:prstGeom prst="rect"/>
-                  </pic:spPr>
-                </pic:pic>
-              </a:graphicData>
-            </a:graphic>
-          </wp:inline>
-        </w:drawing>
-      </w:r>
-    </w:p>
-    <w:p>
-      <w:pPr>
-        <w:keepNext w:val="0"/>
-        <w:spacing w:before="60" w:after="100"/>
-        <w:jc w:val="center"/>
-      </w:pPr>
-      <w:r>
-        <w:rPr>
-          <w:rFonts w:ascii="Times New Roman" w:hAnsi="Times New Roman" w:eastAsia="Times New Roman"/>
-          <w:b w:val="0"/>
-          <w:i/>
-          <w:sz w:val="21"/>
-        </w:rPr>
-        <w:t>Slika 13. Pojedinačni prikaz master zahteva sa detail podacima</w:t>
-      </w:r>
-    </w:p>
-    <w:p>
-      <w:pPr>
-        <w:spacing w:after="100" w:line="259" w:lineRule="auto"/>
-        <w:ind w:firstLine="397"/>
-      </w:pPr>
-      <w:r>
-        <w:rPr>
-          <w:rFonts w:ascii="Times New Roman" w:hAnsi="Times New Roman" w:eastAsia="Times New Roman"/>
-          <w:sz w:val="23"/>
-        </w:rPr>
-        <w:t>Detalji prikazuju jedan master zapis zajedno sa kandidatom, dokumentacijom, roditeljem/starateljem kada postoji i istorijom promena. Na istoj stranici nalazi se akcija za proveru poslovnog pravila, čime se obrada zahteva vezuje za podatke koji su korisniku vidljivi pre odluke.</w:t>
-      </w:r>
-    </w:p>
-    <w:p>
-      <w:pPr>
-        <w:keepNext/>
-        <w:spacing w:after="20"/>
-        <w:jc w:val="center"/>
-      </w:pPr>
-      <w:r>
-        <w:drawing>
-          <wp:inline xmlns:a="http://schemas.openxmlformats.org/drawingml/2006/main" xmlns:pic="http://schemas.openxmlformats.org/drawingml/2006/picture">
-            <wp:extent cx="3586054" cy="4500000"/>
-            <wp:docPr id="16" name="Picture 16" descr="Forma za izmenu zahteva"/>
-            <wp:cNvGraphicFramePr>
-              <a:graphicFrameLocks noChangeAspect="1"/>
-            </wp:cNvGraphicFramePr>
-            <a:graphic>
-              <a:graphicData uri="http://schemas.openxmlformats.org/drawingml/2006/picture">
-                <pic:pic>
-                  <pic:nvPicPr>
-                    <pic:cNvPr id="0" name="10-izmena-zahteva.png"/>
-                    <pic:cNvPicPr/>
-                  </pic:nvPicPr>
-                  <pic:blipFill>
-                    <a:blip r:embed="rId25"/>
-                    <a:stretch>
-                      <a:fillRect/>
-                    </a:stretch>
-                  </pic:blipFill>
-                  <pic:spPr>
-                    <a:xfrm>
-                      <a:off x="0" y="0"/>
-                      <a:ext cx="3586054" cy="4500000"/>
-                    </a:xfrm>
-                    <a:prstGeom prst="rect"/>
-                  </pic:spPr>
-                </pic:pic>
-              </a:graphicData>
-            </a:graphic>
-          </wp:inline>
-        </w:drawing>
-      </w:r>
-    </w:p>
-    <w:p>
-      <w:pPr>
-        <w:keepNext w:val="0"/>
-        <w:spacing w:before="60" w:after="100"/>
-        <w:jc w:val="center"/>
-      </w:pPr>
-      <w:r>
-        <w:rPr>
-          <w:rFonts w:ascii="Times New Roman" w:hAnsi="Times New Roman" w:eastAsia="Times New Roman"/>
-          <w:b w:val="0"/>
-          <w:i/>
-          <w:sz w:val="21"/>
-        </w:rPr>
-        <w:t>Slika 14. Forma za izmenu postojećeg zahteva</w:t>
-      </w:r>
-    </w:p>
-    <w:p>
-      <w:pPr>
-        <w:keepNext/>
         <w:spacing w:before="100" w:after="40"/>
       </w:pPr>
       <w:r>
@@ -8101,63 +8774,6 @@
     <w:p>
       <w:pPr>
         <w:keepNext/>
-        <w:spacing w:after="20"/>
-        <w:jc w:val="center"/>
-      </w:pPr>
-      <w:r>
-        <w:drawing>
-          <wp:inline xmlns:a="http://schemas.openxmlformats.org/drawingml/2006/main" xmlns:pic="http://schemas.openxmlformats.org/drawingml/2006/picture">
-            <wp:extent cx="5332114" cy="3888000"/>
-            <wp:docPr id="17" name="Picture 17" descr="Administratorska potvrda brisanja"/>
-            <wp:cNvGraphicFramePr>
-              <a:graphicFrameLocks noChangeAspect="1"/>
-            </wp:cNvGraphicFramePr>
-            <a:graphic>
-              <a:graphicData uri="http://schemas.openxmlformats.org/drawingml/2006/picture">
-                <pic:pic>
-                  <pic:nvPicPr>
-                    <pic:cNvPr id="0" name="16-administrator-brisanje.png"/>
-                    <pic:cNvPicPr/>
-                  </pic:nvPicPr>
-                  <pic:blipFill>
-                    <a:blip r:embed="rId26"/>
-                    <a:stretch>
-                      <a:fillRect/>
-                    </a:stretch>
-                  </pic:blipFill>
-                  <pic:spPr>
-                    <a:xfrm>
-                      <a:off x="0" y="0"/>
-                      <a:ext cx="5332114" cy="3888000"/>
-                    </a:xfrm>
-                    <a:prstGeom prst="rect"/>
-                  </pic:spPr>
-                </pic:pic>
-              </a:graphicData>
-            </a:graphic>
-          </wp:inline>
-        </w:drawing>
-      </w:r>
-    </w:p>
-    <w:p>
-      <w:pPr>
-        <w:keepNext w:val="0"/>
-        <w:spacing w:before="60" w:after="100"/>
-        <w:jc w:val="center"/>
-      </w:pPr>
-      <w:r>
-        <w:rPr>
-          <w:rFonts w:ascii="Times New Roman" w:hAnsi="Times New Roman" w:eastAsia="Times New Roman"/>
-          <w:b w:val="0"/>
-          <w:i/>
-          <w:sz w:val="21"/>
-        </w:rPr>
-        <w:t>Slika 15. Administratorska potvrda brisanja zahteva</w:t>
-      </w:r>
-    </w:p>
-    <w:p>
-      <w:pPr>
-        <w:keepNext/>
         <w:spacing w:before="100" w:after="40"/>
       </w:pPr>
       <w:r>
@@ -8309,7 +8925,7 @@
           <w:rFonts w:ascii="Times New Roman" w:hAnsi="Times New Roman" w:eastAsia="Times New Roman"/>
           <w:sz w:val="23"/>
         </w:rPr>
-        <w:t>Brisanje proverava DaLiJeAdministrator i za drugu ulogu vraća HTTP 403, dok administratoru prikazuje potvrdu i zatim poziva repozitorijum. U istom kontroleru postoje tri odvojene funkcije štampe: svih zapisa, filtriranih zapisa i pojedinačnog dokumenta po ID-u. Referentov spisak sa Slike 10 ne sadrži akciju brisanja, dok Slika 15 prikazuje ekran koji dobija administrator.</w:t>
+        <w:t>Brisanje proverava DaLiJeAdministrator i za drugu ulogu vraća HTTP 403, dok administratoru prikazuje potvrdu i zatim poziva repozitorijum. U istom kontroleru postoje tri odvojene funkcije štampe: svih zapisa, filtriranih zapisa i pojedinačnog dokumenta po ID-u. Referentov spisak sa Slike 4 ne sadrži akciju brisanja, dok Slika 12 prikazuje ekran koji dobija administrator.</w:t>
       </w:r>
     </w:p>
     <w:p>
@@ -8325,7 +8941,7 @@
           <w:color w:val="4F81BD"/>
           <w:sz w:val="24"/>
         </w:rPr>
-        <w:t>5.1.3. Štampa, filtrirana štampa i pojedinačna parametarska štampa</w:t>
+        <w:t>6.1.3. Štampa, filtrirana štampa i pojedinačna parametarska štampa</w:t>
       </w:r>
     </w:p>
     <w:p>
@@ -8335,120 +8951,6 @@
       </w:pPr>
       <w:r>
         <w:t>Pojedinačna parametarska štampa dokumenta prikazana je ranije na Slici 1 i koristi ID zahteva kao parametar. Njen raspored je usklađen sa dokumentom iz precizirane prijave teme, uključujući polja za potpis i datum. Pored nje postoje dva printer-friendly spiska: kompletan i filtriran. Time su ispunjene tri zahtevane varijante štampe bez dupliranja poslovne logike filtriranja.</w:t>
-      </w:r>
-    </w:p>
-    <w:p>
-      <w:pPr>
-        <w:keepNext/>
-        <w:spacing w:after="20"/>
-        <w:jc w:val="center"/>
-      </w:pPr>
-      <w:r>
-        <w:drawing>
-          <wp:inline xmlns:a="http://schemas.openxmlformats.org/drawingml/2006/main" xmlns:pic="http://schemas.openxmlformats.org/drawingml/2006/picture">
-            <wp:extent cx="5472000" cy="1417538"/>
-            <wp:docPr id="18" name="Picture 18" descr="Štampa svih zahteva"/>
-            <wp:cNvGraphicFramePr>
-              <a:graphicFrameLocks noChangeAspect="1"/>
-            </wp:cNvGraphicFramePr>
-            <a:graphic>
-              <a:graphicData uri="http://schemas.openxmlformats.org/drawingml/2006/picture">
-                <pic:pic>
-                  <pic:nvPicPr>
-                    <pic:cNvPr id="0" name="13-stampa-svih.png"/>
-                    <pic:cNvPicPr/>
-                  </pic:nvPicPr>
-                  <pic:blipFill>
-                    <a:blip r:embed="rId27"/>
-                    <a:stretch>
-                      <a:fillRect/>
-                    </a:stretch>
-                  </pic:blipFill>
-                  <pic:spPr>
-                    <a:xfrm>
-                      <a:off x="0" y="0"/>
-                      <a:ext cx="5472000" cy="1417538"/>
-                    </a:xfrm>
-                    <a:prstGeom prst="rect"/>
-                  </pic:spPr>
-                </pic:pic>
-              </a:graphicData>
-            </a:graphic>
-          </wp:inline>
-        </w:drawing>
-      </w:r>
-    </w:p>
-    <w:p>
-      <w:pPr>
-        <w:keepNext w:val="0"/>
-        <w:spacing w:before="60" w:after="100"/>
-        <w:jc w:val="center"/>
-      </w:pPr>
-      <w:r>
-        <w:rPr>
-          <w:rFonts w:ascii="Times New Roman" w:hAnsi="Times New Roman" w:eastAsia="Times New Roman"/>
-          <w:b w:val="0"/>
-          <w:i/>
-          <w:sz w:val="21"/>
-        </w:rPr>
-        <w:t>Slika 16. Printer-friendly štampa svih zahteva</w:t>
-      </w:r>
-    </w:p>
-    <w:p>
-      <w:pPr>
-        <w:keepNext/>
-        <w:spacing w:after="20"/>
-        <w:jc w:val="center"/>
-      </w:pPr>
-      <w:r>
-        <w:drawing>
-          <wp:inline xmlns:a="http://schemas.openxmlformats.org/drawingml/2006/main" xmlns:pic="http://schemas.openxmlformats.org/drawingml/2006/picture">
-            <wp:extent cx="5472000" cy="967889"/>
-            <wp:docPr id="19" name="Picture 19" descr="Filtrirana štampa zahteva"/>
-            <wp:cNvGraphicFramePr>
-              <a:graphicFrameLocks noChangeAspect="1"/>
-            </wp:cNvGraphicFramePr>
-            <a:graphic>
-              <a:graphicData uri="http://schemas.openxmlformats.org/drawingml/2006/picture">
-                <pic:pic>
-                  <pic:nvPicPr>
-                    <pic:cNvPr id="0" name="14-stampa-filtriranih.png"/>
-                    <pic:cNvPicPr/>
-                  </pic:nvPicPr>
-                  <pic:blipFill>
-                    <a:blip r:embed="rId28"/>
-                    <a:stretch>
-                      <a:fillRect/>
-                    </a:stretch>
-                  </pic:blipFill>
-                  <pic:spPr>
-                    <a:xfrm>
-                      <a:off x="0" y="0"/>
-                      <a:ext cx="5472000" cy="967889"/>
-                    </a:xfrm>
-                    <a:prstGeom prst="rect"/>
-                  </pic:spPr>
-                </pic:pic>
-              </a:graphicData>
-            </a:graphic>
-          </wp:inline>
-        </w:drawing>
-      </w:r>
-    </w:p>
-    <w:p>
-      <w:pPr>
-        <w:keepNext w:val="0"/>
-        <w:spacing w:before="60" w:after="100"/>
-        <w:jc w:val="center"/>
-      </w:pPr>
-      <w:r>
-        <w:rPr>
-          <w:rFonts w:ascii="Times New Roman" w:hAnsi="Times New Roman" w:eastAsia="Times New Roman"/>
-          <w:b w:val="0"/>
-          <w:i/>
-          <w:sz w:val="21"/>
-        </w:rPr>
-        <w:t>Slika 17. Printer-friendly štampa filtriranih zahteva</w:t>
       </w:r>
     </w:p>
     <w:p>
@@ -8464,64 +8966,7 @@
           <w:color w:val="4F81BD"/>
           <w:sz w:val="26"/>
         </w:rPr>
-        <w:t>5.2. Realizacija osnovnih validacija</w:t>
-      </w:r>
-    </w:p>
-    <w:p>
-      <w:pPr>
-        <w:keepNext/>
-        <w:spacing w:after="20"/>
-        <w:jc w:val="center"/>
-      </w:pPr>
-      <w:r>
-        <w:drawing>
-          <wp:inline xmlns:a="http://schemas.openxmlformats.org/drawingml/2006/main" xmlns:pic="http://schemas.openxmlformats.org/drawingml/2006/picture">
-            <wp:extent cx="3386390" cy="4320000"/>
-            <wp:docPr id="20" name="Picture 20" descr="Validacije forme"/>
-            <wp:cNvGraphicFramePr>
-              <a:graphicFrameLocks noChangeAspect="1"/>
-            </wp:cNvGraphicFramePr>
-            <a:graphic>
-              <a:graphicData uri="http://schemas.openxmlformats.org/drawingml/2006/picture">
-                <pic:pic>
-                  <pic:nvPicPr>
-                    <pic:cNvPr id="0" name="06-validacije-forme.png"/>
-                    <pic:cNvPicPr/>
-                  </pic:nvPicPr>
-                  <pic:blipFill>
-                    <a:blip r:embed="rId29"/>
-                    <a:stretch>
-                      <a:fillRect/>
-                    </a:stretch>
-                  </pic:blipFill>
-                  <pic:spPr>
-                    <a:xfrm>
-                      <a:off x="0" y="0"/>
-                      <a:ext cx="3386390" cy="4320000"/>
-                    </a:xfrm>
-                    <a:prstGeom prst="rect"/>
-                  </pic:spPr>
-                </pic:pic>
-              </a:graphicData>
-            </a:graphic>
-          </wp:inline>
-        </w:drawing>
-      </w:r>
-    </w:p>
-    <w:p>
-      <w:pPr>
-        <w:keepNext w:val="0"/>
-        <w:spacing w:before="60" w:after="100"/>
-        <w:jc w:val="center"/>
-      </w:pPr>
-      <w:r>
-        <w:rPr>
-          <w:rFonts w:ascii="Times New Roman" w:hAnsi="Times New Roman" w:eastAsia="Times New Roman"/>
-          <w:b w:val="0"/>
-          <w:i/>
-          <w:sz w:val="21"/>
-        </w:rPr>
-        <w:t>Slika 18. Klijentske i serverske poruke validacije na formi</w:t>
+        <w:t>6.2. Realizacija osnovnih validacija</w:t>
       </w:r>
     </w:p>
     <w:p>
@@ -9058,7 +9503,7 @@
           <w:color w:val="4F81BD"/>
           <w:sz w:val="26"/>
         </w:rPr>
-        <w:t>5.3. Prezentacioni sloj - realizacija MVC i ViewModel-a</w:t>
+        <w:t>6.3. Prezentacioni sloj - realizacija MVC i ViewModel-a</w:t>
       </w:r>
     </w:p>
     <w:p>
@@ -9192,121 +9637,7 @@
           <w:color w:val="4F81BD"/>
           <w:sz w:val="26"/>
         </w:rPr>
-        <w:t>5.4. Sloj poslovne logike - realizacija poslovnog pravila</w:t>
-      </w:r>
-    </w:p>
-    <w:p>
-      <w:pPr>
-        <w:keepNext/>
-        <w:spacing w:after="20"/>
-        <w:jc w:val="center"/>
-      </w:pPr>
-      <w:r>
-        <w:drawing>
-          <wp:inline xmlns:a="http://schemas.openxmlformats.org/drawingml/2006/main" xmlns:pic="http://schemas.openxmlformats.org/drawingml/2006/picture">
-            <wp:extent cx="4371609" cy="4320000"/>
-            <wp:docPr id="21" name="Picture 21" descr="Neispunjeno poslovno pravilo"/>
-            <wp:cNvGraphicFramePr>
-              <a:graphicFrameLocks noChangeAspect="1"/>
-            </wp:cNvGraphicFramePr>
-            <a:graphic>
-              <a:graphicData uri="http://schemas.openxmlformats.org/drawingml/2006/picture">
-                <pic:pic>
-                  <pic:nvPicPr>
-                    <pic:cNvPr id="0" name="08-poslovno-pravilo-odbijanje.png"/>
-                    <pic:cNvPicPr/>
-                  </pic:nvPicPr>
-                  <pic:blipFill>
-                    <a:blip r:embed="rId30"/>
-                    <a:stretch>
-                      <a:fillRect/>
-                    </a:stretch>
-                  </pic:blipFill>
-                  <pic:spPr>
-                    <a:xfrm>
-                      <a:off x="0" y="0"/>
-                      <a:ext cx="4371609" cy="4320000"/>
-                    </a:xfrm>
-                    <a:prstGeom prst="rect"/>
-                  </pic:spPr>
-                </pic:pic>
-              </a:graphicData>
-            </a:graphic>
-          </wp:inline>
-        </w:drawing>
-      </w:r>
-    </w:p>
-    <w:p>
-      <w:pPr>
-        <w:keepNext w:val="0"/>
-        <w:spacing w:before="60" w:after="100"/>
-        <w:jc w:val="center"/>
-      </w:pPr>
-      <w:r>
-        <w:rPr>
-          <w:rFonts w:ascii="Times New Roman" w:hAnsi="Times New Roman" w:eastAsia="Times New Roman"/>
-          <w:b w:val="0"/>
-          <w:i/>
-          <w:sz w:val="21"/>
-        </w:rPr>
-        <w:t>Slika 19. Neuspešna provera poslovnog pravila sa konkretnim razlogom</w:t>
-      </w:r>
-    </w:p>
-    <w:p>
-      <w:pPr>
-        <w:keepNext/>
-        <w:spacing w:after="20"/>
-        <w:jc w:val="center"/>
-      </w:pPr>
-      <w:r>
-        <w:drawing>
-          <wp:inline xmlns:a="http://schemas.openxmlformats.org/drawingml/2006/main" xmlns:pic="http://schemas.openxmlformats.org/drawingml/2006/picture">
-            <wp:extent cx="4220352" cy="4320000"/>
-            <wp:docPr id="22" name="Picture 22" descr="Uspešno odobrenje poslovnog pravila"/>
-            <wp:cNvGraphicFramePr>
-              <a:graphicFrameLocks noChangeAspect="1"/>
-            </wp:cNvGraphicFramePr>
-            <a:graphic>
-              <a:graphicData uri="http://schemas.openxmlformats.org/drawingml/2006/picture">
-                <pic:pic>
-                  <pic:nvPicPr>
-                    <pic:cNvPr id="0" name="09-poslovno-pravilo-odobrenje.png"/>
-                    <pic:cNvPicPr/>
-                  </pic:nvPicPr>
-                  <pic:blipFill>
-                    <a:blip r:embed="rId31"/>
-                    <a:stretch>
-                      <a:fillRect/>
-                    </a:stretch>
-                  </pic:blipFill>
-                  <pic:spPr>
-                    <a:xfrm>
-                      <a:off x="0" y="0"/>
-                      <a:ext cx="4220352" cy="4320000"/>
-                    </a:xfrm>
-                    <a:prstGeom prst="rect"/>
-                  </pic:spPr>
-                </pic:pic>
-              </a:graphicData>
-            </a:graphic>
-          </wp:inline>
-        </w:drawing>
-      </w:r>
-    </w:p>
-    <w:p>
-      <w:pPr>
-        <w:keepNext w:val="0"/>
-        <w:spacing w:before="60" w:after="100"/>
-        <w:jc w:val="center"/>
-      </w:pPr>
-      <w:r>
-        <w:rPr>
-          <w:rFonts w:ascii="Times New Roman" w:hAnsi="Times New Roman" w:eastAsia="Times New Roman"/>
-          <w:b w:val="0"/>
-          <w:i/>
-          <w:sz w:val="21"/>
-        </w:rPr>
-        <w:t>Slika 20. Uspešna provera poslovnog pravila i status Odobren</w:t>
+        <w:t>6.4. Sloj poslovne logike - realizacija poslovnog pravila</w:t>
       </w:r>
     </w:p>
     <w:p>
@@ -9319,7 +9650,7 @@
           <w:rFonts w:ascii="Times New Roman" w:hAnsi="Times New Roman" w:eastAsia="Times New Roman"/>
           <w:sz w:val="23"/>
         </w:rPr>
-        <w:t>Na Slici 19 sistem zadržava neodobren status kada test sposobnosti nije položen i prikazuje razlog. Slika 20 prikazuje pozitivan scenario u kome su pregled, test i dokazna dokumentacija validni, nakon čega zahtev dobija status „Odobren“. Odluka nije samo provera obaveznog polja: zavisi od promenljivog parametra X iz eksternog JSON izvora i od vremenskog poređenja datuma.</w:t>
+        <w:t>Na Slici 10 sistem zadržava neodobren status kada test sposobnosti nije položen i prikazuje razlog. Slika 11 prikazuje pozitivan scenario u kome su pregled, test i dokazna dokumentacija validni, nakon čega zahtev dobija status „Odobren“. Odluka nije samo provera obaveznog polja: zavisi od promenljivog parametra X iz eksternog JSON izvora i od vremenskog poređenja datuma.</w:t>
       </w:r>
     </w:p>
     <w:p>
@@ -9600,64 +9931,7 @@
           <w:color w:val="4F81BD"/>
           <w:sz w:val="26"/>
         </w:rPr>
-        <w:t>5.5. Sloj servisa - realizacija REST servisa</w:t>
-      </w:r>
-    </w:p>
-    <w:p>
-      <w:pPr>
-        <w:keepNext/>
-        <w:spacing w:after="20"/>
-        <w:jc w:val="center"/>
-      </w:pPr>
-      <w:r>
-        <w:drawing>
-          <wp:inline xmlns:a="http://schemas.openxmlformats.org/drawingml/2006/main" xmlns:pic="http://schemas.openxmlformats.org/drawingml/2006/picture">
-            <wp:extent cx="5400000" cy="761250"/>
-            <wp:docPr id="23" name="Picture 23" descr="REST JSON odgovor"/>
-            <wp:cNvGraphicFramePr>
-              <a:graphicFrameLocks noChangeAspect="1"/>
-            </wp:cNvGraphicFramePr>
-            <a:graphic>
-              <a:graphicData uri="http://schemas.openxmlformats.org/drawingml/2006/picture">
-                <pic:pic>
-                  <pic:nvPicPr>
-                    <pic:cNvPr id="0" name="15-rest-json.png"/>
-                    <pic:cNvPicPr/>
-                  </pic:nvPicPr>
-                  <pic:blipFill>
-                    <a:blip r:embed="rId32"/>
-                    <a:stretch>
-                      <a:fillRect/>
-                    </a:stretch>
-                  </pic:blipFill>
-                  <pic:spPr>
-                    <a:xfrm>
-                      <a:off x="0" y="0"/>
-                      <a:ext cx="5400000" cy="761250"/>
-                    </a:xfrm>
-                    <a:prstGeom prst="rect"/>
-                  </pic:spPr>
-                </pic:pic>
-              </a:graphicData>
-            </a:graphic>
-          </wp:inline>
-        </w:drawing>
-      </w:r>
-    </w:p>
-    <w:p>
-      <w:pPr>
-        <w:keepNext w:val="0"/>
-        <w:spacing w:before="60" w:after="100"/>
-        <w:jc w:val="center"/>
-      </w:pPr>
-      <w:r>
-        <w:rPr>
-          <w:rFonts w:ascii="Times New Roman" w:hAnsi="Times New Roman" w:eastAsia="Times New Roman"/>
-          <w:b w:val="0"/>
-          <w:i/>
-          <w:sz w:val="21"/>
-        </w:rPr>
-        <w:t>Slika 21. REST odgovor za konkretan zahtev u JSON formatu</w:t>
+        <w:t>6.5. Sloj servisa - realizacija REST servisa</w:t>
       </w:r>
     </w:p>
     <w:p>
@@ -9670,7 +9944,7 @@
           <w:rFonts w:ascii="Times New Roman" w:hAnsi="Times New Roman" w:eastAsia="Times New Roman"/>
           <w:sz w:val="23"/>
         </w:rPr>
-        <w:t>REST servis ima dve namene koje odgovaraju kriterijumu: CRUD pristup zahtevima preko /api/zahtevi i izlaganje parametara poslovnih pravila preko /api/parametri/poslovna-pravila. Slika 21 je stvarni JSON odgovor servisa za konkretan zahtev. DTO i mapirajuća klasa odvajaju HTTP model od EF entiteta.</w:t>
+        <w:t>REST servis ima dve namene koje odgovaraju kriterijumu: CRUD pristup zahtevima preko /api/zahtevi i izlaganje parametara poslovnih pravila preko /api/parametri/poslovna-pravila. Slika 15 je stvarni JSON odgovor servisa za konkretan zahtev. DTO i mapirajuća klasa odvajaju HTTP model od EF entiteta.</w:t>
       </w:r>
     </w:p>
     <w:p>
@@ -9998,7 +10272,7 @@
           <w:rFonts w:ascii="Times New Roman" w:hAnsi="Times New Roman" w:eastAsia="Times New Roman"/>
           <w:sz w:val="23"/>
         </w:rPr>
-        <w:t>ParametriController izlaže GET rutu poslovna-pravila i vraća rezultat datotečkog servisa. Datotečki servis određuje fizičku putanju App_Data/poslovna_pravila.json, čita sadržaj, deserijalizuje ga i proverava opsege. Ovim je jasno razdvojeno gde se parametar čuva, gde se čita i kako postaje dostupan drugim slojevima.</w:t>
+        <w:t>ParametriController izlaže GET rutu poslovna-pravila i vraća rezultat datotečkog servisa. Datotečki servis određuje fizičku putanju App_Data/poslovna_pravila.json, čita sadržaj, deserijalizuje ga i proverava opsege. Ovim je jasno razdvojeno izlaganje API rute od čitanja datoteke. Početni MVC kontroler REST projekta nazvan je PocetnaController; sufiks Controller zadržan je zato što ga ASP.NET MVC zahteva kao konvenciju, dok je naziv klase preveden na srpski.</w:t>
       </w:r>
     </w:p>
     <w:p>
@@ -10328,7 +10602,7 @@
           <w:color w:val="4F81BD"/>
           <w:sz w:val="26"/>
         </w:rPr>
-        <w:t>5.6. Sloj za rad sa podacima</w:t>
+        <w:t>6.6. Sloj za rad sa podacima</w:t>
       </w:r>
     </w:p>
     <w:p>
@@ -10344,7 +10618,7 @@
           <w:color w:val="4F81BD"/>
           <w:sz w:val="24"/>
         </w:rPr>
-        <w:t>5.6.1. Repository Pattern</w:t>
+        <w:t>6.6.1. Repository Pattern</w:t>
       </w:r>
     </w:p>
     <w:p>
@@ -10487,7 +10761,7 @@
           <w:rFonts w:ascii="Times New Roman" w:hAnsi="Times New Roman" w:eastAsia="Times New Roman"/>
           <w:sz w:val="23"/>
         </w:rPr>
-        <w:t>Interfejs definiše sve operacije koje su potrebne višim slojevima: spisak/filter, pojedinačni zapis, master-detail unos i izmenu, kontrolisanu promenu statusa, potvrdu odobrenja i brisanje. Poslovna logika zavisi od ovog ugovora, a ne od DbContext klase, što smanjuje spregnutost između slojeva.</w:t>
+        <w:t>Interfejs definiše sve operacije koje su potrebne višim slojevima: spisak/filter, pojedinačni zapis, master-detail unos i izmenu, kontrolisanu promenu statusa, potvrdu odobrenja i brisanje. Poslovna logika zavisi od ovog ugovora, a ne od DbContext klase, što smanjuje spregnutost između slojeva. U finalnoj strukturi samostalne biblioteke klasa DBUtils, interfejsi i konkretne klase repozitorijuma nalaze se u folderu Repozitorijumi, izvan foldera TehnoloskeKlase. Folder TehnoloskeKlase sadrži samo OsnovnaTehnoloskaKlasa i TabelaKlasa, pa je razdvajanje odgovornosti vidljivo i u strukturi projekta.</w:t>
       </w:r>
     </w:p>
     <w:p>
@@ -10503,7 +10777,7 @@
           <w:color w:val="4F81BD"/>
           <w:sz w:val="24"/>
         </w:rPr>
-        <w:t>5.6.2. Rad sa stored procedurama</w:t>
+        <w:t>6.6.2. Rad sa stored procedurama</w:t>
       </w:r>
     </w:p>
     <w:p>
@@ -10628,7 +10902,7 @@
           <w:color w:val="4F81BD"/>
           <w:sz w:val="24"/>
         </w:rPr>
-        <w:t>5.6.3. Rad sa DBUtils i primena upita</w:t>
+        <w:t>6.6.3. Rad sa DBUtils i primena upita</w:t>
       </w:r>
     </w:p>
     <w:p>
@@ -10903,7 +11177,7 @@
           <w:color w:val="4F81BD"/>
           <w:sz w:val="24"/>
         </w:rPr>
-        <w:t>5.6.4. Rad sa Entity Framework klasama</w:t>
+        <w:t>6.6.4. Rad sa Entity Framework klasama</w:t>
       </w:r>
     </w:p>
     <w:p>
@@ -11239,7 +11513,7 @@
           <w:color w:val="4F81BD"/>
           <w:sz w:val="26"/>
         </w:rPr>
-        <w:t>5.7. Realizacija master-detail unosa sa transakcijom i tabelarnog prikaza</w:t>
+        <w:t>6.7. Realizacija master-detail unosa sa transakcijom i tabelarnog prikaza</w:t>
       </w:r>
     </w:p>
     <w:p>
@@ -11427,7 +11701,7 @@
           <w:rFonts w:ascii="Times New Roman" w:hAnsi="Times New Roman" w:eastAsia="Times New Roman"/>
           <w:sz w:val="23"/>
         </w:rPr>
-        <w:t>Tabelarni prikaz master-detail podataka ostvaren je kombinacijom DajSve/DajPoId EF upita sa Include učitavanjem i Razor prikaza. Na Slici 13 vidi se pojedinačni master zapis sa povezanim detail stavkama, dok Slika 10 prikazuje master listu. Time su realizovani i opcionih 10 bodova za transakcioni unos i 5 bodova za prikaz master-detail odnosa.</w:t>
+        <w:t>Tabelarni prikaz master-detail podataka ostvaren je kombinacijom DajSve/DajPoId EF upita sa Include učitavanjem i Razor prikaza. Na Slici 9 vidi se pojedinačni master zapis sa povezanim detail stavkama, dok Slika 4 prikazuje master listu. Time su realizovani i opcionih 10 bodova za transakcioni unos i 5 bodova za prikaz master-detail odnosa.</w:t>
       </w:r>
     </w:p>
     <w:p>
@@ -11443,7 +11717,7 @@
           <w:color w:val="4F81BD"/>
           <w:sz w:val="26"/>
         </w:rPr>
-        <w:t>5.8. JavaScript validacije i regularni izrazi</w:t>
+        <w:t>6.8. JavaScript validacije i regularni izrazi</w:t>
       </w:r>
     </w:p>
     <w:p>
@@ -11657,6 +11931,7 @@
       <w:pPr>
         <w:pStyle w:val="Heading1"/>
         <w:keepNext/>
+        <w:pageBreakBefore/>
         <w:spacing w:before="160" w:after="100"/>
       </w:pPr>
       <w:r>
@@ -11666,7 +11941,7 @@
           <w:color w:val="365F91"/>
           <w:sz w:val="28"/>
         </w:rPr>
-        <w:t>6. Zaključak</w:t>
+        <w:t>7. Zaključak</w:t>
       </w:r>
     </w:p>
     <w:p>
@@ -11718,13 +11993,14 @@
           <w:rFonts w:ascii="Times New Roman" w:hAnsi="Times New Roman" w:eastAsia="Times New Roman"/>
           <w:sz w:val="23"/>
         </w:rPr>
-        <w:t>Funkcionalnost finalnog projekta proverena je automatizovanim testovima na čistom Windows okruženju, uključujući bazu, REST, browser tokove, transakcije, poslovno pravilo, promenu parametra X i tri režima štampe. Screenshotovi korišćeni u ovoj dokumentaciji nastali su iz tog izvršavanja i predstavljaju stvarne prikaze aplikacije. Time dokumentacija, SQL šema, programski kod, UML modeli i runtime dokazi opisuju istu finalnu verziju rešenja.</w:t>
+        <w:t>Funkcionalnost finalnog projekta proverena je automatizovanim testovima na čistom Windows okruženju, uključujući bazu, REST, tokove kroz pregledač, transakcije, poslovno pravilo, promenu parametra X i tri režima štampe. Snimci ekrana korišćeni u ovom radu nastali su neposrednim izvršavanjem aplikacije. Softverske korekcije koje se odnose na izdvajanje repozitorijuma iz foldera tehnoloških klasa i preimenovanje početnog REST kontrolera proverene su završnom regresijom i uključene u glavnu granu projekta.</w:t>
       </w:r>
     </w:p>
     <w:p>
       <w:pPr>
         <w:pStyle w:val="Heading1"/>
         <w:keepNext/>
+        <w:pageBreakBefore/>
         <w:spacing w:before="160" w:after="100"/>
       </w:pPr>
       <w:r>
@@ -11734,7 +12010,7 @@
           <w:color w:val="365F91"/>
           <w:sz w:val="28"/>
         </w:rPr>
-        <w:t>7. Literatura</w:t>
+        <w:t>8. Literatura</w:t>
       </w:r>
     </w:p>
     <w:p>

</xml_diff>